<commit_message>
Trabalho sobre comunicação com Bruno Cano
</commit_message>
<xml_diff>
--- a/Trabalho de BD - Bruno Cano.docx
+++ b/Trabalho de BD - Bruno Cano.docx
@@ -39,57 +39,644 @@
           <w:rFonts w:ascii="Arial" w:hAnsi="Arial" w:cs="Arial"/>
         </w:rPr>
       </w:pPr>
+    </w:p>
+    <w:p>
+      <w:pPr>
+        <w:rPr>
+          <w:rFonts w:ascii="Arial" w:hAnsi="Arial" w:cs="Arial"/>
+        </w:rPr>
+      </w:pPr>
       <w:r>
         <w:rPr>
           <w:rFonts w:ascii="Arial" w:hAnsi="Arial" w:cs="Arial"/>
         </w:rPr>
         <w:t xml:space="preserve">- </w:t>
       </w:r>
-      <w:proofErr w:type="spellStart"/>
-      <w:r>
-        <w:rPr>
-          <w:rFonts w:ascii="Arial" w:hAnsi="Arial" w:cs="Arial"/>
-        </w:rPr>
-        <w:t>Teams</w:t>
-      </w:r>
-      <w:proofErr w:type="spellEnd"/>
-    </w:p>
-    <w:p>
-      <w:pPr>
-        <w:rPr>
-          <w:rFonts w:ascii="Arial" w:hAnsi="Arial" w:cs="Arial"/>
-        </w:rPr>
-      </w:pPr>
-      <w:r>
-        <w:rPr>
-          <w:rFonts w:ascii="Arial" w:hAnsi="Arial" w:cs="Arial"/>
-        </w:rPr>
-        <w:t>- Maior problema é: C</w:t>
-      </w:r>
+      <w:r>
+        <w:rPr>
+          <w:rFonts w:ascii="Arial" w:hAnsi="Arial" w:cs="Arial"/>
+          <w:b/>
+        </w:rPr>
+        <w:t>Slides</w:t>
+      </w:r>
+      <w:r>
+        <w:rPr>
+          <w:rFonts w:ascii="Arial" w:hAnsi="Arial" w:cs="Arial"/>
+        </w:rPr>
+        <w:t xml:space="preserve"> – Mostrar bem o problema, dar uma proposta, e dar uma solução</w:t>
+      </w:r>
+    </w:p>
+    <w:p>
+      <w:pPr>
+        <w:rPr>
+          <w:rFonts w:ascii="Arial" w:hAnsi="Arial" w:cs="Arial"/>
+        </w:rPr>
+      </w:pPr>
+      <w:r>
+        <w:rPr>
+          <w:rFonts w:ascii="Arial" w:hAnsi="Arial" w:cs="Arial"/>
+        </w:rPr>
+        <w:t>- Se quisermos podemos “criar” um aplicativo, pq pode apresentar so a ideia</w:t>
+      </w:r>
+    </w:p>
+    <w:p>
+      <w:pPr>
+        <w:jc w:val="center"/>
+        <w:rPr>
+          <w:rFonts w:ascii="Arial" w:hAnsi="Arial" w:cs="Arial"/>
+          <w:b/>
+        </w:rPr>
+      </w:pPr>
+      <w:r>
+        <w:rPr>
+          <w:rFonts w:ascii="Arial" w:hAnsi="Arial" w:cs="Arial"/>
+          <w:b/>
+        </w:rPr>
+        <w:t>PROBLEMA</w:t>
+      </w:r>
+    </w:p>
+    <w:p>
+      <w:pPr>
+        <w:rPr>
+          <w:rFonts w:ascii="Arial" w:hAnsi="Arial" w:cs="Arial"/>
+        </w:rPr>
+      </w:pPr>
+      <w:r>
+        <w:rPr>
+          <w:rFonts w:ascii="Arial" w:hAnsi="Arial" w:cs="Arial"/>
+        </w:rPr>
+        <w:t>- Bruno Cano não coopera com a gente, demora pra responder</w:t>
+      </w:r>
+      <w:r>
+        <w:rPr>
+          <w:rFonts w:ascii="Arial" w:hAnsi="Arial" w:cs="Arial"/>
+        </w:rPr>
+        <w:t>, falta de proatividade</w:t>
+      </w:r>
+    </w:p>
+    <w:p>
+      <w:pPr>
+        <w:jc w:val="center"/>
+        <w:rPr>
+          <w:rFonts w:ascii="Arial" w:hAnsi="Arial" w:cs="Arial"/>
+          <w:b/>
+        </w:rPr>
+      </w:pPr>
+      <w:r>
+        <w:rPr>
+          <w:rFonts w:ascii="Arial" w:hAnsi="Arial" w:cs="Arial"/>
+          <w:b/>
+        </w:rPr>
+        <w:t>IDEIA</w:t>
+      </w:r>
+      <w:r>
+        <w:rPr>
+          <w:rFonts w:ascii="Arial" w:hAnsi="Arial" w:cs="Arial"/>
+          <w:b/>
+        </w:rPr>
+        <w:t xml:space="preserve"> 1</w:t>
+      </w:r>
+    </w:p>
+    <w:p>
+      <w:pPr>
+        <w:rPr>
+          <w:rFonts w:ascii="Arial" w:hAnsi="Arial" w:cs="Arial"/>
+        </w:rPr>
+      </w:pPr>
+      <w:r>
+        <w:rPr>
+          <w:rFonts w:ascii="Arial" w:hAnsi="Arial" w:cs="Arial"/>
+        </w:rPr>
+        <w:t>- Teams</w:t>
+      </w:r>
+    </w:p>
+    <w:p>
+      <w:pPr>
+        <w:rPr>
+          <w:rFonts w:ascii="Arial" w:hAnsi="Arial" w:cs="Arial"/>
+        </w:rPr>
+      </w:pPr>
+      <w:r>
+        <w:rPr>
+          <w:rFonts w:ascii="Arial" w:hAnsi="Arial" w:cs="Arial"/>
+        </w:rPr>
+        <w:t>- Maior problema é: Comunicação com o Bruno Cano e ele com a gente</w:t>
+      </w:r>
+    </w:p>
+    <w:p>
+      <w:pPr>
+        <w:rPr>
+          <w:rFonts w:ascii="Arial" w:hAnsi="Arial" w:cs="Arial"/>
+        </w:rPr>
+      </w:pPr>
+      <w:r>
+        <w:rPr>
+          <w:rFonts w:ascii="Arial" w:hAnsi="Arial" w:cs="Arial"/>
+        </w:rPr>
+        <w:t>- Criar salas para cada curso e ano que ele é coordenador</w:t>
+      </w:r>
+    </w:p>
+    <w:p>
+      <w:pPr>
+        <w:rPr>
+          <w:rFonts w:ascii="Arial" w:hAnsi="Arial" w:cs="Arial"/>
+        </w:rPr>
+      </w:pPr>
+      <w:r>
+        <w:rPr>
+          <w:rFonts w:ascii="Arial" w:hAnsi="Arial" w:cs="Arial"/>
+        </w:rPr>
+        <w:t>- Criar canais e separar por urgência ou assunto</w:t>
+      </w:r>
+    </w:p>
+    <w:p>
+      <w:pPr>
+        <w:rPr>
+          <w:rFonts w:ascii="Arial" w:hAnsi="Arial" w:cs="Arial"/>
+        </w:rPr>
+      </w:pPr>
+      <w:r>
+        <w:rPr>
+          <w:rFonts w:ascii="Arial" w:hAnsi="Arial" w:cs="Arial"/>
+        </w:rPr>
+        <w:t>- Criar comunicados (Como reunião em dias específicos/liberação mais cedo)</w:t>
+      </w:r>
+    </w:p>
+    <w:p>
+      <w:pPr>
+        <w:rPr>
+          <w:rFonts w:ascii="Arial" w:hAnsi="Arial" w:cs="Arial"/>
+        </w:rPr>
+      </w:pPr>
+      <w:r>
+        <w:rPr>
+          <w:rFonts w:ascii="Arial" w:hAnsi="Arial" w:cs="Arial"/>
+        </w:rPr>
+        <w:t>- Os representantes estariam no grupo e também teriam acesso para mandar mensagens. (Precisamos pegar os livros e dizer os dias que não temos nada)</w:t>
+      </w:r>
+    </w:p>
+    <w:p>
+      <w:pPr>
+        <w:rPr>
+          <w:rFonts w:ascii="Arial" w:hAnsi="Arial" w:cs="Arial"/>
+        </w:rPr>
+      </w:pPr>
+      <w:r>
+        <w:rPr>
+          <w:rFonts w:ascii="Arial" w:hAnsi="Arial" w:cs="Arial"/>
+        </w:rPr>
+        <w:t>- Acompanhar andamentos de projetos como ExpoCuca (A gente manda mensagens explicando o que queremos / estamos fazendo)</w:t>
+      </w:r>
+    </w:p>
+    <w:p>
+      <w:pPr>
+        <w:jc w:val="center"/>
+        <w:rPr>
+          <w:rFonts w:ascii="Arial" w:hAnsi="Arial" w:cs="Arial"/>
+        </w:rPr>
+      </w:pPr>
+      <w:r>
+        <w:rPr>
+          <w:rFonts w:ascii="Arial" w:hAnsi="Arial" w:cs="Arial"/>
+          <w:b/>
+        </w:rPr>
+        <w:t>IDEIA 2</w:t>
+      </w:r>
+    </w:p>
+    <w:p>
+      <w:pPr>
+        <w:rPr>
+          <w:rFonts w:ascii="Arial" w:hAnsi="Arial" w:cs="Arial"/>
+        </w:rPr>
+      </w:pPr>
+      <w:r>
+        <w:rPr>
+          <w:rFonts w:ascii="Arial" w:hAnsi="Arial" w:cs="Arial"/>
+        </w:rPr>
+        <w:t>- Criar aplicativo</w:t>
+      </w:r>
+    </w:p>
+    <w:p>
+      <w:pPr>
+        <w:rPr>
+          <w:rFonts w:ascii="Arial" w:hAnsi="Arial" w:cs="Arial"/>
+        </w:rPr>
+      </w:pPr>
+      <w:r>
+        <w:rPr>
+          <w:rFonts w:ascii="Arial" w:hAnsi="Arial" w:cs="Arial"/>
+        </w:rPr>
+        <w:t>- O aplicativo teria</w:t>
+      </w:r>
+    </w:p>
+    <w:p>
+      <w:pPr>
+        <w:jc w:val="center"/>
+        <w:rPr>
+          <w:rFonts w:ascii="Arial" w:hAnsi="Arial" w:cs="Arial"/>
+          <w:b/>
+        </w:rPr>
+      </w:pPr>
+      <w:r>
+        <w:rPr>
+          <w:rFonts w:ascii="Arial" w:hAnsi="Arial" w:cs="Arial"/>
+          <w:b/>
+        </w:rPr>
+        <w:t>SOLUÇÃO</w:t>
+      </w:r>
+    </w:p>
+    <w:p>
+      <w:pPr>
+        <w:rPr>
+          <w:rFonts w:ascii="Arial" w:hAnsi="Arial" w:cs="Arial"/>
+        </w:rPr>
+      </w:pPr>
+      <w:r>
+        <w:rPr>
+          <w:rFonts w:ascii="Arial" w:hAnsi="Arial" w:cs="Arial"/>
+        </w:rPr>
+        <w:t>- Criar um método para deixar os problemas estruturalmente visíveis (Como um SAQ), com denúncias, problemas que estamos tendo. (Coisas que já escrevemos no teams)</w:t>
+      </w:r>
+    </w:p>
+    <w:p>
+      <w:pPr>
+        <w:spacing w:before="100" w:beforeAutospacing="1" w:after="100" w:afterAutospacing="1" w:line="240" w:lineRule="auto"/>
+        <w:outlineLvl w:val="2"/>
+        <w:rPr>
+          <w:rFonts w:ascii="Arial" w:eastAsia="Times New Roman" w:hAnsi="Arial" w:cs="Arial"/>
+          <w:b/>
+          <w:bCs/>
+          <w:lang w:eastAsia="pt-BR"/>
+        </w:rPr>
+      </w:pPr>
+      <w:r>
+        <w:rPr>
+          <w:rFonts w:ascii="Arial" w:eastAsia="Times New Roman" w:hAnsi="Arial" w:cs="Arial"/>
+          <w:b/>
+          <w:bCs/>
+          <w:lang w:eastAsia="pt-BR"/>
+        </w:rPr>
+        <w:t>1. Canal estruturado de ideias</w:t>
+      </w:r>
+    </w:p>
+    <w:p>
+      <w:pPr>
+        <w:numPr>
+          <w:ilvl w:val="0"/>
+          <w:numId w:val="1"/>
+        </w:numPr>
+        <w:spacing w:before="100" w:beforeAutospacing="1" w:after="100" w:afterAutospacing="1" w:line="240" w:lineRule="auto"/>
+        <w:rPr>
+          <w:rFonts w:ascii="Arial" w:eastAsia="Times New Roman" w:hAnsi="Arial" w:cs="Arial"/>
+          <w:lang w:eastAsia="pt-BR"/>
+        </w:rPr>
+      </w:pPr>
+      <w:r>
+        <w:rPr>
+          <w:rFonts w:ascii="Arial" w:eastAsia="Times New Roman" w:hAnsi="Arial" w:cs="Arial"/>
+          <w:lang w:eastAsia="pt-BR"/>
+        </w:rPr>
+        <w:t xml:space="preserve">Envio de sugestões com título + descrição </w:t>
+      </w:r>
+    </w:p>
+    <w:p>
+      <w:pPr>
+        <w:numPr>
+          <w:ilvl w:val="0"/>
+          <w:numId w:val="1"/>
+        </w:numPr>
+        <w:spacing w:before="100" w:beforeAutospacing="1" w:after="100" w:afterAutospacing="1" w:line="240" w:lineRule="auto"/>
+        <w:rPr>
+          <w:rFonts w:ascii="Arial" w:eastAsia="Times New Roman" w:hAnsi="Arial" w:cs="Arial"/>
+          <w:lang w:eastAsia="pt-BR"/>
+        </w:rPr>
+      </w:pPr>
+      <w:r>
+        <w:rPr>
+          <w:rFonts w:ascii="Arial" w:eastAsia="Times New Roman" w:hAnsi="Arial" w:cs="Arial"/>
+          <w:lang w:eastAsia="pt-BR"/>
+        </w:rPr>
+        <w:t xml:space="preserve">Votação da equipe (tipo “curtir” ou priorizar) </w:t>
+      </w:r>
+    </w:p>
+    <w:p>
+      <w:pPr>
+        <w:numPr>
+          <w:ilvl w:val="0"/>
+          <w:numId w:val="1"/>
+        </w:numPr>
+        <w:spacing w:before="100" w:beforeAutospacing="1" w:after="100" w:afterAutospacing="1" w:line="240" w:lineRule="auto"/>
+        <w:rPr>
+          <w:rFonts w:ascii="Arial" w:eastAsia="Times New Roman" w:hAnsi="Arial" w:cs="Arial"/>
+          <w:lang w:eastAsia="pt-BR"/>
+        </w:rPr>
+      </w:pPr>
+      <w:r>
+        <w:rPr>
+          <w:rFonts w:ascii="Arial" w:eastAsia="Times New Roman" w:hAnsi="Arial" w:cs="Arial"/>
+          <w:lang w:eastAsia="pt-BR"/>
+        </w:rPr>
+        <w:t xml:space="preserve">Status: “em análise”, “aprovado”, “rejeitado” </w:t>
+      </w:r>
+    </w:p>
+    <w:p>
+      <w:pPr>
+        <w:spacing w:before="100" w:beforeAutospacing="1" w:after="100" w:afterAutospacing="1" w:line="240" w:lineRule="auto"/>
+        <w:outlineLvl w:val="2"/>
+        <w:rPr>
+          <w:rFonts w:ascii="Arial" w:eastAsia="Times New Roman" w:hAnsi="Arial" w:cs="Arial"/>
+          <w:b/>
+          <w:bCs/>
+          <w:lang w:eastAsia="pt-BR"/>
+        </w:rPr>
+      </w:pPr>
+      <w:r>
+        <w:rPr>
+          <w:rFonts w:ascii="Arial" w:eastAsia="Times New Roman" w:hAnsi="Arial" w:cs="Arial"/>
+          <w:b/>
+          <w:bCs/>
+          <w:lang w:eastAsia="pt-BR"/>
+        </w:rPr>
+        <w:t>2. Registro de problemas (tipo chamado)</w:t>
+      </w:r>
+    </w:p>
+    <w:p>
+      <w:pPr>
+        <w:numPr>
+          <w:ilvl w:val="0"/>
+          <w:numId w:val="2"/>
+        </w:numPr>
+        <w:spacing w:before="100" w:beforeAutospacing="1" w:after="100" w:afterAutospacing="1" w:line="240" w:lineRule="auto"/>
+        <w:rPr>
+          <w:rFonts w:ascii="Arial" w:eastAsia="Times New Roman" w:hAnsi="Arial" w:cs="Arial"/>
+          <w:lang w:eastAsia="pt-BR"/>
+        </w:rPr>
+      </w:pPr>
+      <w:r>
+        <w:rPr>
+          <w:rFonts w:ascii="Arial" w:eastAsia="Times New Roman" w:hAnsi="Arial" w:cs="Arial"/>
+          <w:lang w:eastAsia="pt-BR"/>
+        </w:rPr>
+        <w:t xml:space="preserve">Relatar problemas com data, descrição e impacto </w:t>
+      </w:r>
+    </w:p>
+    <w:p>
+      <w:pPr>
+        <w:numPr>
+          <w:ilvl w:val="0"/>
+          <w:numId w:val="2"/>
+        </w:numPr>
+        <w:spacing w:before="100" w:beforeAutospacing="1" w:after="100" w:afterAutospacing="1" w:line="240" w:lineRule="auto"/>
+        <w:rPr>
+          <w:rFonts w:ascii="Arial" w:eastAsia="Times New Roman" w:hAnsi="Arial" w:cs="Arial"/>
+          <w:lang w:eastAsia="pt-BR"/>
+        </w:rPr>
+      </w:pPr>
+      <w:r>
+        <w:rPr>
+          <w:rFonts w:ascii="Arial" w:eastAsia="Times New Roman" w:hAnsi="Arial" w:cs="Arial"/>
+          <w:lang w:eastAsia="pt-BR"/>
+        </w:rPr>
+        <w:t xml:space="preserve">Possibilidade de anexar evidências (prints, arquivos) </w:t>
+      </w:r>
+    </w:p>
+    <w:p>
+      <w:pPr>
+        <w:numPr>
+          <w:ilvl w:val="0"/>
+          <w:numId w:val="2"/>
+        </w:numPr>
+        <w:spacing w:before="100" w:beforeAutospacing="1" w:after="100" w:afterAutospacing="1" w:line="240" w:lineRule="auto"/>
+        <w:rPr>
+          <w:rFonts w:ascii="Arial" w:eastAsia="Times New Roman" w:hAnsi="Arial" w:cs="Arial"/>
+          <w:lang w:eastAsia="pt-BR"/>
+        </w:rPr>
+      </w:pPr>
+      <w:r>
+        <w:rPr>
+          <w:rFonts w:ascii="Arial" w:eastAsia="Times New Roman" w:hAnsi="Arial" w:cs="Arial"/>
+          <w:lang w:eastAsia="pt-BR"/>
+        </w:rPr>
+        <w:t xml:space="preserve">Acompanhamento: “aberto”, “em andamento”, “resolvido” </w:t>
+      </w:r>
+    </w:p>
+    <w:p>
+      <w:pPr>
+        <w:spacing w:before="100" w:beforeAutospacing="1" w:after="100" w:afterAutospacing="1" w:line="240" w:lineRule="auto"/>
+        <w:outlineLvl w:val="2"/>
+        <w:rPr>
+          <w:rFonts w:ascii="Arial" w:eastAsia="Times New Roman" w:hAnsi="Arial" w:cs="Arial"/>
+          <w:b/>
+          <w:bCs/>
+          <w:lang w:eastAsia="pt-BR"/>
+        </w:rPr>
+      </w:pPr>
+    </w:p>
+    <w:p>
+      <w:pPr>
+        <w:spacing w:before="100" w:beforeAutospacing="1" w:after="100" w:afterAutospacing="1" w:line="240" w:lineRule="auto"/>
+        <w:outlineLvl w:val="2"/>
+        <w:rPr>
+          <w:rFonts w:ascii="Arial" w:eastAsia="Times New Roman" w:hAnsi="Arial" w:cs="Arial"/>
+          <w:b/>
+          <w:bCs/>
+          <w:lang w:eastAsia="pt-BR"/>
+        </w:rPr>
+      </w:pPr>
       <w:bookmarkStart w:id="0" w:name="_GoBack"/>
       <w:bookmarkEnd w:id="0"/>
-      <w:r>
-        <w:rPr>
-          <w:rFonts w:ascii="Arial" w:hAnsi="Arial" w:cs="Arial"/>
-        </w:rPr>
-        <w:t>omunicação</w:t>
-      </w:r>
-      <w:r>
-        <w:rPr>
-          <w:rFonts w:ascii="Arial" w:hAnsi="Arial" w:cs="Arial"/>
-        </w:rPr>
-        <w:t xml:space="preserve"> com o Bruno Cano e ele com a gente</w:t>
-      </w:r>
-    </w:p>
-    <w:p>
-      <w:pPr>
-        <w:rPr>
-          <w:rFonts w:ascii="Arial" w:hAnsi="Arial" w:cs="Arial"/>
-        </w:rPr>
-      </w:pPr>
-      <w:r>
-        <w:rPr>
-          <w:rFonts w:ascii="Arial" w:hAnsi="Arial" w:cs="Arial"/>
+    </w:p>
+    <w:p>
+      <w:pPr>
+        <w:spacing w:before="100" w:beforeAutospacing="1" w:after="100" w:afterAutospacing="1" w:line="240" w:lineRule="auto"/>
+        <w:outlineLvl w:val="2"/>
+        <w:rPr>
+          <w:rFonts w:ascii="Arial" w:eastAsia="Times New Roman" w:hAnsi="Arial" w:cs="Arial"/>
+          <w:b/>
+          <w:bCs/>
+          <w:lang w:eastAsia="pt-BR"/>
+        </w:rPr>
+      </w:pPr>
+      <w:r>
+        <w:rPr>
+          <w:rFonts w:ascii="Arial" w:eastAsia="Times New Roman" w:hAnsi="Arial" w:cs="Arial"/>
+          <w:b/>
+          <w:bCs/>
+          <w:lang w:eastAsia="pt-BR"/>
+        </w:rPr>
+        <w:lastRenderedPageBreak/>
+        <w:t>3. Comunicação centralizada</w:t>
+      </w:r>
+    </w:p>
+    <w:p>
+      <w:pPr>
+        <w:numPr>
+          <w:ilvl w:val="0"/>
+          <w:numId w:val="3"/>
+        </w:numPr>
+        <w:spacing w:before="100" w:beforeAutospacing="1" w:after="100" w:afterAutospacing="1" w:line="240" w:lineRule="auto"/>
+        <w:rPr>
+          <w:rFonts w:ascii="Arial" w:eastAsia="Times New Roman" w:hAnsi="Arial" w:cs="Arial"/>
+          <w:lang w:eastAsia="pt-BR"/>
+        </w:rPr>
+      </w:pPr>
+      <w:r>
+        <w:rPr>
+          <w:rFonts w:ascii="Arial" w:eastAsia="Times New Roman" w:hAnsi="Arial" w:cs="Arial"/>
+          <w:lang w:eastAsia="pt-BR"/>
+        </w:rPr>
+        <w:t xml:space="preserve">Mensagens organizadas por assunto (não só chat solto) </w:t>
+      </w:r>
+    </w:p>
+    <w:p>
+      <w:pPr>
+        <w:numPr>
+          <w:ilvl w:val="0"/>
+          <w:numId w:val="3"/>
+        </w:numPr>
+        <w:spacing w:before="100" w:beforeAutospacing="1" w:after="100" w:afterAutospacing="1" w:line="240" w:lineRule="auto"/>
+        <w:rPr>
+          <w:rFonts w:ascii="Arial" w:eastAsia="Times New Roman" w:hAnsi="Arial" w:cs="Arial"/>
+          <w:lang w:eastAsia="pt-BR"/>
+        </w:rPr>
+      </w:pPr>
+      <w:r>
+        <w:rPr>
+          <w:rFonts w:ascii="Arial" w:eastAsia="Times New Roman" w:hAnsi="Arial" w:cs="Arial"/>
+          <w:lang w:eastAsia="pt-BR"/>
+        </w:rPr>
+        <w:t xml:space="preserve">Evita ruído e perda de informação </w:t>
+      </w:r>
+    </w:p>
+    <w:p>
+      <w:pPr>
+        <w:spacing w:before="100" w:beforeAutospacing="1" w:after="100" w:afterAutospacing="1" w:line="240" w:lineRule="auto"/>
+        <w:outlineLvl w:val="2"/>
+        <w:rPr>
+          <w:rFonts w:ascii="Arial" w:eastAsia="Times New Roman" w:hAnsi="Arial" w:cs="Arial"/>
+          <w:b/>
+          <w:bCs/>
+          <w:lang w:eastAsia="pt-BR"/>
+        </w:rPr>
+      </w:pPr>
+      <w:r>
+        <w:rPr>
+          <w:rFonts w:ascii="Arial" w:eastAsia="Times New Roman" w:hAnsi="Arial" w:cs="Arial"/>
+          <w:b/>
+          <w:bCs/>
+          <w:lang w:eastAsia="pt-BR"/>
+        </w:rPr>
+        <w:t>4. Transparência nas decisões</w:t>
+      </w:r>
+    </w:p>
+    <w:p>
+      <w:pPr>
+        <w:numPr>
+          <w:ilvl w:val="0"/>
+          <w:numId w:val="4"/>
+        </w:numPr>
+        <w:spacing w:before="100" w:beforeAutospacing="1" w:after="100" w:afterAutospacing="1" w:line="240" w:lineRule="auto"/>
+        <w:rPr>
+          <w:rFonts w:ascii="Arial" w:eastAsia="Times New Roman" w:hAnsi="Arial" w:cs="Arial"/>
+          <w:lang w:eastAsia="pt-BR"/>
+        </w:rPr>
+      </w:pPr>
+      <w:r>
+        <w:rPr>
+          <w:rFonts w:ascii="Arial" w:eastAsia="Times New Roman" w:hAnsi="Arial" w:cs="Arial"/>
+          <w:lang w:eastAsia="pt-BR"/>
+        </w:rPr>
+        <w:t xml:space="preserve">Toda decisão registrada com justificativa </w:t>
+      </w:r>
+    </w:p>
+    <w:p>
+      <w:pPr>
+        <w:numPr>
+          <w:ilvl w:val="0"/>
+          <w:numId w:val="4"/>
+        </w:numPr>
+        <w:spacing w:before="100" w:beforeAutospacing="1" w:after="100" w:afterAutospacing="1" w:line="240" w:lineRule="auto"/>
+        <w:rPr>
+          <w:rFonts w:ascii="Arial" w:eastAsia="Times New Roman" w:hAnsi="Arial" w:cs="Arial"/>
+          <w:lang w:eastAsia="pt-BR"/>
+        </w:rPr>
+      </w:pPr>
+      <w:r>
+        <w:rPr>
+          <w:rFonts w:ascii="Arial" w:eastAsia="Times New Roman" w:hAnsi="Arial" w:cs="Arial"/>
+          <w:lang w:eastAsia="pt-BR"/>
+        </w:rPr>
+        <w:t xml:space="preserve">Quem aprovou / recusou </w:t>
+      </w:r>
+    </w:p>
+    <w:p>
+      <w:pPr>
+        <w:spacing w:before="100" w:beforeAutospacing="1" w:after="100" w:afterAutospacing="1" w:line="240" w:lineRule="auto"/>
+        <w:outlineLvl w:val="2"/>
+        <w:rPr>
+          <w:rFonts w:ascii="Arial" w:eastAsia="Times New Roman" w:hAnsi="Arial" w:cs="Arial"/>
+          <w:b/>
+          <w:bCs/>
+          <w:lang w:eastAsia="pt-BR"/>
+        </w:rPr>
+      </w:pPr>
+      <w:r>
+        <w:rPr>
+          <w:rFonts w:ascii="Arial" w:eastAsia="Times New Roman" w:hAnsi="Arial" w:cs="Arial"/>
+          <w:b/>
+          <w:bCs/>
+          <w:lang w:eastAsia="pt-BR"/>
+        </w:rPr>
+        <w:t>5. Feedback anônimo (opcional)</w:t>
+      </w:r>
+    </w:p>
+    <w:p>
+      <w:pPr>
+        <w:numPr>
+          <w:ilvl w:val="0"/>
+          <w:numId w:val="5"/>
+        </w:numPr>
+        <w:spacing w:before="100" w:beforeAutospacing="1" w:after="100" w:afterAutospacing="1" w:line="240" w:lineRule="auto"/>
+        <w:rPr>
+          <w:rFonts w:ascii="Arial" w:eastAsia="Times New Roman" w:hAnsi="Arial" w:cs="Arial"/>
+          <w:lang w:eastAsia="pt-BR"/>
+        </w:rPr>
+      </w:pPr>
+      <w:r>
+        <w:rPr>
+          <w:rFonts w:ascii="Arial" w:eastAsia="Times New Roman" w:hAnsi="Arial" w:cs="Arial"/>
+          <w:lang w:eastAsia="pt-BR"/>
+        </w:rPr>
+        <w:t xml:space="preserve">Permite que a equipe fale sem medo </w:t>
+      </w:r>
+    </w:p>
+    <w:p>
+      <w:pPr>
+        <w:numPr>
+          <w:ilvl w:val="0"/>
+          <w:numId w:val="5"/>
+        </w:numPr>
+        <w:spacing w:before="100" w:beforeAutospacing="1" w:after="100" w:afterAutospacing="1" w:line="240" w:lineRule="auto"/>
+        <w:rPr>
+          <w:rFonts w:ascii="Arial" w:eastAsia="Times New Roman" w:hAnsi="Arial" w:cs="Arial"/>
+          <w:sz w:val="24"/>
+          <w:szCs w:val="24"/>
+          <w:lang w:eastAsia="pt-BR"/>
+        </w:rPr>
+      </w:pPr>
+      <w:r>
+        <w:rPr>
+          <w:rFonts w:ascii="Arial" w:eastAsia="Times New Roman" w:hAnsi="Arial" w:cs="Arial"/>
+          <w:lang w:eastAsia="pt-BR"/>
+        </w:rPr>
+        <w:t>Pode revelar padrões de comportamento</w:t>
+      </w:r>
+      <w:r>
+        <w:rPr>
+          <w:rFonts w:ascii="Arial" w:eastAsia="Times New Roman" w:hAnsi="Arial" w:cs="Arial"/>
+          <w:sz w:val="24"/>
+          <w:szCs w:val="24"/>
+          <w:lang w:eastAsia="pt-BR"/>
         </w:rPr>
         <w:t xml:space="preserve"> </w:t>
       </w:r>
@@ -100,78 +687,20 @@
           <w:rFonts w:ascii="Arial" w:hAnsi="Arial" w:cs="Arial"/>
         </w:rPr>
       </w:pPr>
-      <w:r>
-        <w:rPr>
-          <w:rFonts w:ascii="Arial" w:hAnsi="Arial" w:cs="Arial"/>
-        </w:rPr>
-        <w:t>- Criar salas para cada curso e ano que ele é coordenador</w:t>
-      </w:r>
-    </w:p>
-    <w:p>
-      <w:pPr>
-        <w:rPr>
-          <w:rFonts w:ascii="Arial" w:hAnsi="Arial" w:cs="Arial"/>
-        </w:rPr>
-      </w:pPr>
-      <w:r>
-        <w:rPr>
-          <w:rFonts w:ascii="Arial" w:hAnsi="Arial" w:cs="Arial"/>
-        </w:rPr>
-        <w:t>- Criar canais e separar por urgência ou assunto</w:t>
-      </w:r>
-    </w:p>
-    <w:p>
-      <w:pPr>
-        <w:rPr>
-          <w:rFonts w:ascii="Arial" w:hAnsi="Arial" w:cs="Arial"/>
-        </w:rPr>
-      </w:pPr>
-      <w:r>
-        <w:rPr>
-          <w:rFonts w:ascii="Arial" w:hAnsi="Arial" w:cs="Arial"/>
-        </w:rPr>
-        <w:t>- Criar comunicados (Como reunião em dias específicos/liberação mais cedo)</w:t>
-      </w:r>
-    </w:p>
-    <w:p>
-      <w:pPr>
-        <w:rPr>
-          <w:rFonts w:ascii="Arial" w:hAnsi="Arial" w:cs="Arial"/>
-        </w:rPr>
-      </w:pPr>
-      <w:r>
-        <w:rPr>
-          <w:rFonts w:ascii="Arial" w:hAnsi="Arial" w:cs="Arial"/>
-        </w:rPr>
-        <w:t>- Os representantes estariam no grupo e também teriam acesso para mandar mensagens. (Precisamos pegar os livros e dizer os dias que não temos nada)</w:t>
-      </w:r>
-    </w:p>
-    <w:p>
-      <w:pPr>
-        <w:rPr>
-          <w:rFonts w:ascii="Arial" w:hAnsi="Arial" w:cs="Arial"/>
-        </w:rPr>
-      </w:pPr>
-      <w:r>
-        <w:rPr>
-          <w:rFonts w:ascii="Arial" w:hAnsi="Arial" w:cs="Arial"/>
-        </w:rPr>
-        <w:t xml:space="preserve">- Acompanhar andamentos de projetos como </w:t>
-      </w:r>
-      <w:proofErr w:type="spellStart"/>
-      <w:r>
-        <w:rPr>
-          <w:rFonts w:ascii="Arial" w:hAnsi="Arial" w:cs="Arial"/>
-        </w:rPr>
-        <w:t>ExpoCuca</w:t>
-      </w:r>
-      <w:proofErr w:type="spellEnd"/>
-      <w:r>
-        <w:rPr>
-          <w:rFonts w:ascii="Arial" w:hAnsi="Arial" w:cs="Arial"/>
-        </w:rPr>
-        <w:t xml:space="preserve"> (A gente manda mensagens explicando o que queremos / estamos fazendo)</w:t>
-      </w:r>
+    </w:p>
+    <w:p>
+      <w:pPr>
+        <w:rPr>
+          <w:rFonts w:ascii="Arial" w:hAnsi="Arial" w:cs="Arial"/>
+        </w:rPr>
+      </w:pPr>
+    </w:p>
+    <w:p>
+      <w:pPr>
+        <w:rPr>
+          <w:rFonts w:ascii="Arial" w:hAnsi="Arial" w:cs="Arial"/>
+        </w:rPr>
+      </w:pPr>
     </w:p>
     <w:sectPr>
       <w:pgSz w:w="11906" w:h="16838"/>
@@ -181,6 +710,771 @@
     </w:sectPr>
   </w:body>
 </w:document>
+</file>
+
+<file path=word/numbering.xml><?xml version="1.0" encoding="utf-8"?>
+<w:numbering xmlns:wpc="http://schemas.microsoft.com/office/word/2010/wordprocessingCanvas" xmlns:cx="http://schemas.microsoft.com/office/drawing/2014/chartex" xmlns:cx1="http://schemas.microsoft.com/office/drawing/2015/9/8/chartex" xmlns:cx2="http://schemas.microsoft.com/office/drawing/2015/10/21/chartex" xmlns:cx3="http://schemas.microsoft.com/office/drawing/2016/5/9/chartex" xmlns:cx4="http://schemas.microsoft.com/office/drawing/2016/5/10/chartex" xmlns:cx5="http://schemas.microsoft.com/office/drawing/2016/5/11/chartex" xmlns:cx6="http://schemas.microsoft.com/office/drawing/2016/5/12/chartex" xmlns:cx7="http://schemas.microsoft.com/office/drawing/2016/5/13/chartex" xmlns:cx8="http://schemas.microsoft.com/office/drawing/2016/5/14/chartex" xmlns:mc="http://schemas.openxmlformats.org/markup-compatibility/2006" xmlns:aink="http://schemas.microsoft.com/office/drawing/2016/ink" xmlns:am3d="http://schemas.microsoft.com/office/drawing/2017/model3d" xmlns:o="urn:schemas-microsoft-com:office:office" xmlns:r="http://schemas.openxmlformats.org/officeDocument/2006/relationships" xmlns:m="http://schemas.openxmlformats.org/officeDocument/2006/math" xmlns:v="urn:schemas-microsoft-com:vml" xmlns:wp14="http://schemas.microsoft.com/office/word/2010/wordprocessingDrawing" xmlns:wp="http://schemas.openxmlformats.org/drawingml/2006/wordprocessingDrawing" xmlns:w10="urn:schemas-microsoft-com:office:word" xmlns:w="http://schemas.openxmlformats.org/wordprocessingml/2006/main" xmlns:w14="http://schemas.microsoft.com/office/word/2010/wordml" xmlns:w15="http://schemas.microsoft.com/office/word/2012/wordml" xmlns:w16cid="http://schemas.microsoft.com/office/word/2016/wordml/cid" xmlns:w16se="http://schemas.microsoft.com/office/word/2015/wordml/symex" xmlns:wpg="http://schemas.microsoft.com/office/word/2010/wordprocessingGroup" xmlns:wpi="http://schemas.microsoft.com/office/word/2010/wordprocessingInk" xmlns:wne="http://schemas.microsoft.com/office/word/2006/wordml" xmlns:wps="http://schemas.microsoft.com/office/word/2010/wordprocessingShape" mc:Ignorable="w14 w15 w16se w16cid wp14">
+  <w:abstractNum w:abstractNumId="0" w15:restartNumberingAfterBreak="0">
+    <w:nsid w:val="1F500A7B"/>
+    <w:multiLevelType w:val="multilevel"/>
+    <w:tmpl w:val="73FACE3C"/>
+    <w:lvl w:ilvl="0">
+      <w:start w:val="1"/>
+      <w:numFmt w:val="bullet"/>
+      <w:lvlText w:val=""/>
+      <w:lvlJc w:val="left"/>
+      <w:pPr>
+        <w:tabs>
+          <w:tab w:val="num" w:pos="720"/>
+        </w:tabs>
+        <w:ind w:left="720" w:hanging="360"/>
+      </w:pPr>
+      <w:rPr>
+        <w:rFonts w:ascii="Symbol" w:hAnsi="Symbol" w:hint="default"/>
+        <w:sz w:val="20"/>
+      </w:rPr>
+    </w:lvl>
+    <w:lvl w:ilvl="1" w:tentative="1">
+      <w:start w:val="1"/>
+      <w:numFmt w:val="bullet"/>
+      <w:lvlText w:val="o"/>
+      <w:lvlJc w:val="left"/>
+      <w:pPr>
+        <w:tabs>
+          <w:tab w:val="num" w:pos="1440"/>
+        </w:tabs>
+        <w:ind w:left="1440" w:hanging="360"/>
+      </w:pPr>
+      <w:rPr>
+        <w:rFonts w:ascii="Courier New" w:hAnsi="Courier New" w:hint="default"/>
+        <w:sz w:val="20"/>
+      </w:rPr>
+    </w:lvl>
+    <w:lvl w:ilvl="2" w:tentative="1">
+      <w:start w:val="1"/>
+      <w:numFmt w:val="bullet"/>
+      <w:lvlText w:val=""/>
+      <w:lvlJc w:val="left"/>
+      <w:pPr>
+        <w:tabs>
+          <w:tab w:val="num" w:pos="2160"/>
+        </w:tabs>
+        <w:ind w:left="2160" w:hanging="360"/>
+      </w:pPr>
+      <w:rPr>
+        <w:rFonts w:ascii="Wingdings" w:hAnsi="Wingdings" w:hint="default"/>
+        <w:sz w:val="20"/>
+      </w:rPr>
+    </w:lvl>
+    <w:lvl w:ilvl="3" w:tentative="1">
+      <w:start w:val="1"/>
+      <w:numFmt w:val="bullet"/>
+      <w:lvlText w:val=""/>
+      <w:lvlJc w:val="left"/>
+      <w:pPr>
+        <w:tabs>
+          <w:tab w:val="num" w:pos="2880"/>
+        </w:tabs>
+        <w:ind w:left="2880" w:hanging="360"/>
+      </w:pPr>
+      <w:rPr>
+        <w:rFonts w:ascii="Wingdings" w:hAnsi="Wingdings" w:hint="default"/>
+        <w:sz w:val="20"/>
+      </w:rPr>
+    </w:lvl>
+    <w:lvl w:ilvl="4" w:tentative="1">
+      <w:start w:val="1"/>
+      <w:numFmt w:val="bullet"/>
+      <w:lvlText w:val=""/>
+      <w:lvlJc w:val="left"/>
+      <w:pPr>
+        <w:tabs>
+          <w:tab w:val="num" w:pos="3600"/>
+        </w:tabs>
+        <w:ind w:left="3600" w:hanging="360"/>
+      </w:pPr>
+      <w:rPr>
+        <w:rFonts w:ascii="Wingdings" w:hAnsi="Wingdings" w:hint="default"/>
+        <w:sz w:val="20"/>
+      </w:rPr>
+    </w:lvl>
+    <w:lvl w:ilvl="5" w:tentative="1">
+      <w:start w:val="1"/>
+      <w:numFmt w:val="bullet"/>
+      <w:lvlText w:val=""/>
+      <w:lvlJc w:val="left"/>
+      <w:pPr>
+        <w:tabs>
+          <w:tab w:val="num" w:pos="4320"/>
+        </w:tabs>
+        <w:ind w:left="4320" w:hanging="360"/>
+      </w:pPr>
+      <w:rPr>
+        <w:rFonts w:ascii="Wingdings" w:hAnsi="Wingdings" w:hint="default"/>
+        <w:sz w:val="20"/>
+      </w:rPr>
+    </w:lvl>
+    <w:lvl w:ilvl="6" w:tentative="1">
+      <w:start w:val="1"/>
+      <w:numFmt w:val="bullet"/>
+      <w:lvlText w:val=""/>
+      <w:lvlJc w:val="left"/>
+      <w:pPr>
+        <w:tabs>
+          <w:tab w:val="num" w:pos="5040"/>
+        </w:tabs>
+        <w:ind w:left="5040" w:hanging="360"/>
+      </w:pPr>
+      <w:rPr>
+        <w:rFonts w:ascii="Wingdings" w:hAnsi="Wingdings" w:hint="default"/>
+        <w:sz w:val="20"/>
+      </w:rPr>
+    </w:lvl>
+    <w:lvl w:ilvl="7" w:tentative="1">
+      <w:start w:val="1"/>
+      <w:numFmt w:val="bullet"/>
+      <w:lvlText w:val=""/>
+      <w:lvlJc w:val="left"/>
+      <w:pPr>
+        <w:tabs>
+          <w:tab w:val="num" w:pos="5760"/>
+        </w:tabs>
+        <w:ind w:left="5760" w:hanging="360"/>
+      </w:pPr>
+      <w:rPr>
+        <w:rFonts w:ascii="Wingdings" w:hAnsi="Wingdings" w:hint="default"/>
+        <w:sz w:val="20"/>
+      </w:rPr>
+    </w:lvl>
+    <w:lvl w:ilvl="8" w:tentative="1">
+      <w:start w:val="1"/>
+      <w:numFmt w:val="bullet"/>
+      <w:lvlText w:val=""/>
+      <w:lvlJc w:val="left"/>
+      <w:pPr>
+        <w:tabs>
+          <w:tab w:val="num" w:pos="6480"/>
+        </w:tabs>
+        <w:ind w:left="6480" w:hanging="360"/>
+      </w:pPr>
+      <w:rPr>
+        <w:rFonts w:ascii="Wingdings" w:hAnsi="Wingdings" w:hint="default"/>
+        <w:sz w:val="20"/>
+      </w:rPr>
+    </w:lvl>
+  </w:abstractNum>
+  <w:abstractNum w:abstractNumId="1" w15:restartNumberingAfterBreak="0">
+    <w:nsid w:val="31FE09CB"/>
+    <w:multiLevelType w:val="multilevel"/>
+    <w:tmpl w:val="DAB4DA78"/>
+    <w:lvl w:ilvl="0">
+      <w:start w:val="1"/>
+      <w:numFmt w:val="bullet"/>
+      <w:lvlText w:val=""/>
+      <w:lvlJc w:val="left"/>
+      <w:pPr>
+        <w:tabs>
+          <w:tab w:val="num" w:pos="720"/>
+        </w:tabs>
+        <w:ind w:left="720" w:hanging="360"/>
+      </w:pPr>
+      <w:rPr>
+        <w:rFonts w:ascii="Symbol" w:hAnsi="Symbol" w:hint="default"/>
+        <w:sz w:val="20"/>
+      </w:rPr>
+    </w:lvl>
+    <w:lvl w:ilvl="1" w:tentative="1">
+      <w:start w:val="1"/>
+      <w:numFmt w:val="bullet"/>
+      <w:lvlText w:val="o"/>
+      <w:lvlJc w:val="left"/>
+      <w:pPr>
+        <w:tabs>
+          <w:tab w:val="num" w:pos="1440"/>
+        </w:tabs>
+        <w:ind w:left="1440" w:hanging="360"/>
+      </w:pPr>
+      <w:rPr>
+        <w:rFonts w:ascii="Courier New" w:hAnsi="Courier New" w:hint="default"/>
+        <w:sz w:val="20"/>
+      </w:rPr>
+    </w:lvl>
+    <w:lvl w:ilvl="2" w:tentative="1">
+      <w:start w:val="1"/>
+      <w:numFmt w:val="bullet"/>
+      <w:lvlText w:val=""/>
+      <w:lvlJc w:val="left"/>
+      <w:pPr>
+        <w:tabs>
+          <w:tab w:val="num" w:pos="2160"/>
+        </w:tabs>
+        <w:ind w:left="2160" w:hanging="360"/>
+      </w:pPr>
+      <w:rPr>
+        <w:rFonts w:ascii="Wingdings" w:hAnsi="Wingdings" w:hint="default"/>
+        <w:sz w:val="20"/>
+      </w:rPr>
+    </w:lvl>
+    <w:lvl w:ilvl="3" w:tentative="1">
+      <w:start w:val="1"/>
+      <w:numFmt w:val="bullet"/>
+      <w:lvlText w:val=""/>
+      <w:lvlJc w:val="left"/>
+      <w:pPr>
+        <w:tabs>
+          <w:tab w:val="num" w:pos="2880"/>
+        </w:tabs>
+        <w:ind w:left="2880" w:hanging="360"/>
+      </w:pPr>
+      <w:rPr>
+        <w:rFonts w:ascii="Wingdings" w:hAnsi="Wingdings" w:hint="default"/>
+        <w:sz w:val="20"/>
+      </w:rPr>
+    </w:lvl>
+    <w:lvl w:ilvl="4" w:tentative="1">
+      <w:start w:val="1"/>
+      <w:numFmt w:val="bullet"/>
+      <w:lvlText w:val=""/>
+      <w:lvlJc w:val="left"/>
+      <w:pPr>
+        <w:tabs>
+          <w:tab w:val="num" w:pos="3600"/>
+        </w:tabs>
+        <w:ind w:left="3600" w:hanging="360"/>
+      </w:pPr>
+      <w:rPr>
+        <w:rFonts w:ascii="Wingdings" w:hAnsi="Wingdings" w:hint="default"/>
+        <w:sz w:val="20"/>
+      </w:rPr>
+    </w:lvl>
+    <w:lvl w:ilvl="5" w:tentative="1">
+      <w:start w:val="1"/>
+      <w:numFmt w:val="bullet"/>
+      <w:lvlText w:val=""/>
+      <w:lvlJc w:val="left"/>
+      <w:pPr>
+        <w:tabs>
+          <w:tab w:val="num" w:pos="4320"/>
+        </w:tabs>
+        <w:ind w:left="4320" w:hanging="360"/>
+      </w:pPr>
+      <w:rPr>
+        <w:rFonts w:ascii="Wingdings" w:hAnsi="Wingdings" w:hint="default"/>
+        <w:sz w:val="20"/>
+      </w:rPr>
+    </w:lvl>
+    <w:lvl w:ilvl="6" w:tentative="1">
+      <w:start w:val="1"/>
+      <w:numFmt w:val="bullet"/>
+      <w:lvlText w:val=""/>
+      <w:lvlJc w:val="left"/>
+      <w:pPr>
+        <w:tabs>
+          <w:tab w:val="num" w:pos="5040"/>
+        </w:tabs>
+        <w:ind w:left="5040" w:hanging="360"/>
+      </w:pPr>
+      <w:rPr>
+        <w:rFonts w:ascii="Wingdings" w:hAnsi="Wingdings" w:hint="default"/>
+        <w:sz w:val="20"/>
+      </w:rPr>
+    </w:lvl>
+    <w:lvl w:ilvl="7" w:tentative="1">
+      <w:start w:val="1"/>
+      <w:numFmt w:val="bullet"/>
+      <w:lvlText w:val=""/>
+      <w:lvlJc w:val="left"/>
+      <w:pPr>
+        <w:tabs>
+          <w:tab w:val="num" w:pos="5760"/>
+        </w:tabs>
+        <w:ind w:left="5760" w:hanging="360"/>
+      </w:pPr>
+      <w:rPr>
+        <w:rFonts w:ascii="Wingdings" w:hAnsi="Wingdings" w:hint="default"/>
+        <w:sz w:val="20"/>
+      </w:rPr>
+    </w:lvl>
+    <w:lvl w:ilvl="8" w:tentative="1">
+      <w:start w:val="1"/>
+      <w:numFmt w:val="bullet"/>
+      <w:lvlText w:val=""/>
+      <w:lvlJc w:val="left"/>
+      <w:pPr>
+        <w:tabs>
+          <w:tab w:val="num" w:pos="6480"/>
+        </w:tabs>
+        <w:ind w:left="6480" w:hanging="360"/>
+      </w:pPr>
+      <w:rPr>
+        <w:rFonts w:ascii="Wingdings" w:hAnsi="Wingdings" w:hint="default"/>
+        <w:sz w:val="20"/>
+      </w:rPr>
+    </w:lvl>
+  </w:abstractNum>
+  <w:abstractNum w:abstractNumId="2" w15:restartNumberingAfterBreak="0">
+    <w:nsid w:val="4E124FED"/>
+    <w:multiLevelType w:val="multilevel"/>
+    <w:tmpl w:val="E0828B08"/>
+    <w:lvl w:ilvl="0">
+      <w:start w:val="1"/>
+      <w:numFmt w:val="bullet"/>
+      <w:lvlText w:val=""/>
+      <w:lvlJc w:val="left"/>
+      <w:pPr>
+        <w:tabs>
+          <w:tab w:val="num" w:pos="720"/>
+        </w:tabs>
+        <w:ind w:left="720" w:hanging="360"/>
+      </w:pPr>
+      <w:rPr>
+        <w:rFonts w:ascii="Symbol" w:hAnsi="Symbol" w:hint="default"/>
+        <w:sz w:val="20"/>
+      </w:rPr>
+    </w:lvl>
+    <w:lvl w:ilvl="1" w:tentative="1">
+      <w:start w:val="1"/>
+      <w:numFmt w:val="bullet"/>
+      <w:lvlText w:val="o"/>
+      <w:lvlJc w:val="left"/>
+      <w:pPr>
+        <w:tabs>
+          <w:tab w:val="num" w:pos="1440"/>
+        </w:tabs>
+        <w:ind w:left="1440" w:hanging="360"/>
+      </w:pPr>
+      <w:rPr>
+        <w:rFonts w:ascii="Courier New" w:hAnsi="Courier New" w:hint="default"/>
+        <w:sz w:val="20"/>
+      </w:rPr>
+    </w:lvl>
+    <w:lvl w:ilvl="2" w:tentative="1">
+      <w:start w:val="1"/>
+      <w:numFmt w:val="bullet"/>
+      <w:lvlText w:val=""/>
+      <w:lvlJc w:val="left"/>
+      <w:pPr>
+        <w:tabs>
+          <w:tab w:val="num" w:pos="2160"/>
+        </w:tabs>
+        <w:ind w:left="2160" w:hanging="360"/>
+      </w:pPr>
+      <w:rPr>
+        <w:rFonts w:ascii="Wingdings" w:hAnsi="Wingdings" w:hint="default"/>
+        <w:sz w:val="20"/>
+      </w:rPr>
+    </w:lvl>
+    <w:lvl w:ilvl="3" w:tentative="1">
+      <w:start w:val="1"/>
+      <w:numFmt w:val="bullet"/>
+      <w:lvlText w:val=""/>
+      <w:lvlJc w:val="left"/>
+      <w:pPr>
+        <w:tabs>
+          <w:tab w:val="num" w:pos="2880"/>
+        </w:tabs>
+        <w:ind w:left="2880" w:hanging="360"/>
+      </w:pPr>
+      <w:rPr>
+        <w:rFonts w:ascii="Wingdings" w:hAnsi="Wingdings" w:hint="default"/>
+        <w:sz w:val="20"/>
+      </w:rPr>
+    </w:lvl>
+    <w:lvl w:ilvl="4" w:tentative="1">
+      <w:start w:val="1"/>
+      <w:numFmt w:val="bullet"/>
+      <w:lvlText w:val=""/>
+      <w:lvlJc w:val="left"/>
+      <w:pPr>
+        <w:tabs>
+          <w:tab w:val="num" w:pos="3600"/>
+        </w:tabs>
+        <w:ind w:left="3600" w:hanging="360"/>
+      </w:pPr>
+      <w:rPr>
+        <w:rFonts w:ascii="Wingdings" w:hAnsi="Wingdings" w:hint="default"/>
+        <w:sz w:val="20"/>
+      </w:rPr>
+    </w:lvl>
+    <w:lvl w:ilvl="5" w:tentative="1">
+      <w:start w:val="1"/>
+      <w:numFmt w:val="bullet"/>
+      <w:lvlText w:val=""/>
+      <w:lvlJc w:val="left"/>
+      <w:pPr>
+        <w:tabs>
+          <w:tab w:val="num" w:pos="4320"/>
+        </w:tabs>
+        <w:ind w:left="4320" w:hanging="360"/>
+      </w:pPr>
+      <w:rPr>
+        <w:rFonts w:ascii="Wingdings" w:hAnsi="Wingdings" w:hint="default"/>
+        <w:sz w:val="20"/>
+      </w:rPr>
+    </w:lvl>
+    <w:lvl w:ilvl="6" w:tentative="1">
+      <w:start w:val="1"/>
+      <w:numFmt w:val="bullet"/>
+      <w:lvlText w:val=""/>
+      <w:lvlJc w:val="left"/>
+      <w:pPr>
+        <w:tabs>
+          <w:tab w:val="num" w:pos="5040"/>
+        </w:tabs>
+        <w:ind w:left="5040" w:hanging="360"/>
+      </w:pPr>
+      <w:rPr>
+        <w:rFonts w:ascii="Wingdings" w:hAnsi="Wingdings" w:hint="default"/>
+        <w:sz w:val="20"/>
+      </w:rPr>
+    </w:lvl>
+    <w:lvl w:ilvl="7" w:tentative="1">
+      <w:start w:val="1"/>
+      <w:numFmt w:val="bullet"/>
+      <w:lvlText w:val=""/>
+      <w:lvlJc w:val="left"/>
+      <w:pPr>
+        <w:tabs>
+          <w:tab w:val="num" w:pos="5760"/>
+        </w:tabs>
+        <w:ind w:left="5760" w:hanging="360"/>
+      </w:pPr>
+      <w:rPr>
+        <w:rFonts w:ascii="Wingdings" w:hAnsi="Wingdings" w:hint="default"/>
+        <w:sz w:val="20"/>
+      </w:rPr>
+    </w:lvl>
+    <w:lvl w:ilvl="8" w:tentative="1">
+      <w:start w:val="1"/>
+      <w:numFmt w:val="bullet"/>
+      <w:lvlText w:val=""/>
+      <w:lvlJc w:val="left"/>
+      <w:pPr>
+        <w:tabs>
+          <w:tab w:val="num" w:pos="6480"/>
+        </w:tabs>
+        <w:ind w:left="6480" w:hanging="360"/>
+      </w:pPr>
+      <w:rPr>
+        <w:rFonts w:ascii="Wingdings" w:hAnsi="Wingdings" w:hint="default"/>
+        <w:sz w:val="20"/>
+      </w:rPr>
+    </w:lvl>
+  </w:abstractNum>
+  <w:abstractNum w:abstractNumId="3" w15:restartNumberingAfterBreak="0">
+    <w:nsid w:val="6F253366"/>
+    <w:multiLevelType w:val="multilevel"/>
+    <w:tmpl w:val="1C0C7C28"/>
+    <w:lvl w:ilvl="0">
+      <w:start w:val="1"/>
+      <w:numFmt w:val="bullet"/>
+      <w:lvlText w:val=""/>
+      <w:lvlJc w:val="left"/>
+      <w:pPr>
+        <w:tabs>
+          <w:tab w:val="num" w:pos="720"/>
+        </w:tabs>
+        <w:ind w:left="720" w:hanging="360"/>
+      </w:pPr>
+      <w:rPr>
+        <w:rFonts w:ascii="Symbol" w:hAnsi="Symbol" w:hint="default"/>
+        <w:sz w:val="20"/>
+      </w:rPr>
+    </w:lvl>
+    <w:lvl w:ilvl="1" w:tentative="1">
+      <w:start w:val="1"/>
+      <w:numFmt w:val="bullet"/>
+      <w:lvlText w:val="o"/>
+      <w:lvlJc w:val="left"/>
+      <w:pPr>
+        <w:tabs>
+          <w:tab w:val="num" w:pos="1440"/>
+        </w:tabs>
+        <w:ind w:left="1440" w:hanging="360"/>
+      </w:pPr>
+      <w:rPr>
+        <w:rFonts w:ascii="Courier New" w:hAnsi="Courier New" w:hint="default"/>
+        <w:sz w:val="20"/>
+      </w:rPr>
+    </w:lvl>
+    <w:lvl w:ilvl="2" w:tentative="1">
+      <w:start w:val="1"/>
+      <w:numFmt w:val="bullet"/>
+      <w:lvlText w:val=""/>
+      <w:lvlJc w:val="left"/>
+      <w:pPr>
+        <w:tabs>
+          <w:tab w:val="num" w:pos="2160"/>
+        </w:tabs>
+        <w:ind w:left="2160" w:hanging="360"/>
+      </w:pPr>
+      <w:rPr>
+        <w:rFonts w:ascii="Wingdings" w:hAnsi="Wingdings" w:hint="default"/>
+        <w:sz w:val="20"/>
+      </w:rPr>
+    </w:lvl>
+    <w:lvl w:ilvl="3" w:tentative="1">
+      <w:start w:val="1"/>
+      <w:numFmt w:val="bullet"/>
+      <w:lvlText w:val=""/>
+      <w:lvlJc w:val="left"/>
+      <w:pPr>
+        <w:tabs>
+          <w:tab w:val="num" w:pos="2880"/>
+        </w:tabs>
+        <w:ind w:left="2880" w:hanging="360"/>
+      </w:pPr>
+      <w:rPr>
+        <w:rFonts w:ascii="Wingdings" w:hAnsi="Wingdings" w:hint="default"/>
+        <w:sz w:val="20"/>
+      </w:rPr>
+    </w:lvl>
+    <w:lvl w:ilvl="4" w:tentative="1">
+      <w:start w:val="1"/>
+      <w:numFmt w:val="bullet"/>
+      <w:lvlText w:val=""/>
+      <w:lvlJc w:val="left"/>
+      <w:pPr>
+        <w:tabs>
+          <w:tab w:val="num" w:pos="3600"/>
+        </w:tabs>
+        <w:ind w:left="3600" w:hanging="360"/>
+      </w:pPr>
+      <w:rPr>
+        <w:rFonts w:ascii="Wingdings" w:hAnsi="Wingdings" w:hint="default"/>
+        <w:sz w:val="20"/>
+      </w:rPr>
+    </w:lvl>
+    <w:lvl w:ilvl="5" w:tentative="1">
+      <w:start w:val="1"/>
+      <w:numFmt w:val="bullet"/>
+      <w:lvlText w:val=""/>
+      <w:lvlJc w:val="left"/>
+      <w:pPr>
+        <w:tabs>
+          <w:tab w:val="num" w:pos="4320"/>
+        </w:tabs>
+        <w:ind w:left="4320" w:hanging="360"/>
+      </w:pPr>
+      <w:rPr>
+        <w:rFonts w:ascii="Wingdings" w:hAnsi="Wingdings" w:hint="default"/>
+        <w:sz w:val="20"/>
+      </w:rPr>
+    </w:lvl>
+    <w:lvl w:ilvl="6" w:tentative="1">
+      <w:start w:val="1"/>
+      <w:numFmt w:val="bullet"/>
+      <w:lvlText w:val=""/>
+      <w:lvlJc w:val="left"/>
+      <w:pPr>
+        <w:tabs>
+          <w:tab w:val="num" w:pos="5040"/>
+        </w:tabs>
+        <w:ind w:left="5040" w:hanging="360"/>
+      </w:pPr>
+      <w:rPr>
+        <w:rFonts w:ascii="Wingdings" w:hAnsi="Wingdings" w:hint="default"/>
+        <w:sz w:val="20"/>
+      </w:rPr>
+    </w:lvl>
+    <w:lvl w:ilvl="7" w:tentative="1">
+      <w:start w:val="1"/>
+      <w:numFmt w:val="bullet"/>
+      <w:lvlText w:val=""/>
+      <w:lvlJc w:val="left"/>
+      <w:pPr>
+        <w:tabs>
+          <w:tab w:val="num" w:pos="5760"/>
+        </w:tabs>
+        <w:ind w:left="5760" w:hanging="360"/>
+      </w:pPr>
+      <w:rPr>
+        <w:rFonts w:ascii="Wingdings" w:hAnsi="Wingdings" w:hint="default"/>
+        <w:sz w:val="20"/>
+      </w:rPr>
+    </w:lvl>
+    <w:lvl w:ilvl="8" w:tentative="1">
+      <w:start w:val="1"/>
+      <w:numFmt w:val="bullet"/>
+      <w:lvlText w:val=""/>
+      <w:lvlJc w:val="left"/>
+      <w:pPr>
+        <w:tabs>
+          <w:tab w:val="num" w:pos="6480"/>
+        </w:tabs>
+        <w:ind w:left="6480" w:hanging="360"/>
+      </w:pPr>
+      <w:rPr>
+        <w:rFonts w:ascii="Wingdings" w:hAnsi="Wingdings" w:hint="default"/>
+        <w:sz w:val="20"/>
+      </w:rPr>
+    </w:lvl>
+  </w:abstractNum>
+  <w:abstractNum w:abstractNumId="4" w15:restartNumberingAfterBreak="0">
+    <w:nsid w:val="787C78E6"/>
+    <w:multiLevelType w:val="multilevel"/>
+    <w:tmpl w:val="B4A81C06"/>
+    <w:lvl w:ilvl="0">
+      <w:start w:val="1"/>
+      <w:numFmt w:val="bullet"/>
+      <w:lvlText w:val=""/>
+      <w:lvlJc w:val="left"/>
+      <w:pPr>
+        <w:tabs>
+          <w:tab w:val="num" w:pos="720"/>
+        </w:tabs>
+        <w:ind w:left="720" w:hanging="360"/>
+      </w:pPr>
+      <w:rPr>
+        <w:rFonts w:ascii="Symbol" w:hAnsi="Symbol" w:hint="default"/>
+        <w:sz w:val="20"/>
+      </w:rPr>
+    </w:lvl>
+    <w:lvl w:ilvl="1" w:tentative="1">
+      <w:start w:val="1"/>
+      <w:numFmt w:val="bullet"/>
+      <w:lvlText w:val="o"/>
+      <w:lvlJc w:val="left"/>
+      <w:pPr>
+        <w:tabs>
+          <w:tab w:val="num" w:pos="1440"/>
+        </w:tabs>
+        <w:ind w:left="1440" w:hanging="360"/>
+      </w:pPr>
+      <w:rPr>
+        <w:rFonts w:ascii="Courier New" w:hAnsi="Courier New" w:hint="default"/>
+        <w:sz w:val="20"/>
+      </w:rPr>
+    </w:lvl>
+    <w:lvl w:ilvl="2" w:tentative="1">
+      <w:start w:val="1"/>
+      <w:numFmt w:val="bullet"/>
+      <w:lvlText w:val=""/>
+      <w:lvlJc w:val="left"/>
+      <w:pPr>
+        <w:tabs>
+          <w:tab w:val="num" w:pos="2160"/>
+        </w:tabs>
+        <w:ind w:left="2160" w:hanging="360"/>
+      </w:pPr>
+      <w:rPr>
+        <w:rFonts w:ascii="Wingdings" w:hAnsi="Wingdings" w:hint="default"/>
+        <w:sz w:val="20"/>
+      </w:rPr>
+    </w:lvl>
+    <w:lvl w:ilvl="3" w:tentative="1">
+      <w:start w:val="1"/>
+      <w:numFmt w:val="bullet"/>
+      <w:lvlText w:val=""/>
+      <w:lvlJc w:val="left"/>
+      <w:pPr>
+        <w:tabs>
+          <w:tab w:val="num" w:pos="2880"/>
+        </w:tabs>
+        <w:ind w:left="2880" w:hanging="360"/>
+      </w:pPr>
+      <w:rPr>
+        <w:rFonts w:ascii="Wingdings" w:hAnsi="Wingdings" w:hint="default"/>
+        <w:sz w:val="20"/>
+      </w:rPr>
+    </w:lvl>
+    <w:lvl w:ilvl="4" w:tentative="1">
+      <w:start w:val="1"/>
+      <w:numFmt w:val="bullet"/>
+      <w:lvlText w:val=""/>
+      <w:lvlJc w:val="left"/>
+      <w:pPr>
+        <w:tabs>
+          <w:tab w:val="num" w:pos="3600"/>
+        </w:tabs>
+        <w:ind w:left="3600" w:hanging="360"/>
+      </w:pPr>
+      <w:rPr>
+        <w:rFonts w:ascii="Wingdings" w:hAnsi="Wingdings" w:hint="default"/>
+        <w:sz w:val="20"/>
+      </w:rPr>
+    </w:lvl>
+    <w:lvl w:ilvl="5" w:tentative="1">
+      <w:start w:val="1"/>
+      <w:numFmt w:val="bullet"/>
+      <w:lvlText w:val=""/>
+      <w:lvlJc w:val="left"/>
+      <w:pPr>
+        <w:tabs>
+          <w:tab w:val="num" w:pos="4320"/>
+        </w:tabs>
+        <w:ind w:left="4320" w:hanging="360"/>
+      </w:pPr>
+      <w:rPr>
+        <w:rFonts w:ascii="Wingdings" w:hAnsi="Wingdings" w:hint="default"/>
+        <w:sz w:val="20"/>
+      </w:rPr>
+    </w:lvl>
+    <w:lvl w:ilvl="6" w:tentative="1">
+      <w:start w:val="1"/>
+      <w:numFmt w:val="bullet"/>
+      <w:lvlText w:val=""/>
+      <w:lvlJc w:val="left"/>
+      <w:pPr>
+        <w:tabs>
+          <w:tab w:val="num" w:pos="5040"/>
+        </w:tabs>
+        <w:ind w:left="5040" w:hanging="360"/>
+      </w:pPr>
+      <w:rPr>
+        <w:rFonts w:ascii="Wingdings" w:hAnsi="Wingdings" w:hint="default"/>
+        <w:sz w:val="20"/>
+      </w:rPr>
+    </w:lvl>
+    <w:lvl w:ilvl="7" w:tentative="1">
+      <w:start w:val="1"/>
+      <w:numFmt w:val="bullet"/>
+      <w:lvlText w:val=""/>
+      <w:lvlJc w:val="left"/>
+      <w:pPr>
+        <w:tabs>
+          <w:tab w:val="num" w:pos="5760"/>
+        </w:tabs>
+        <w:ind w:left="5760" w:hanging="360"/>
+      </w:pPr>
+      <w:rPr>
+        <w:rFonts w:ascii="Wingdings" w:hAnsi="Wingdings" w:hint="default"/>
+        <w:sz w:val="20"/>
+      </w:rPr>
+    </w:lvl>
+    <w:lvl w:ilvl="8" w:tentative="1">
+      <w:start w:val="1"/>
+      <w:numFmt w:val="bullet"/>
+      <w:lvlText w:val=""/>
+      <w:lvlJc w:val="left"/>
+      <w:pPr>
+        <w:tabs>
+          <w:tab w:val="num" w:pos="6480"/>
+        </w:tabs>
+        <w:ind w:left="6480" w:hanging="360"/>
+      </w:pPr>
+      <w:rPr>
+        <w:rFonts w:ascii="Wingdings" w:hAnsi="Wingdings" w:hint="default"/>
+        <w:sz w:val="20"/>
+      </w:rPr>
+    </w:lvl>
+  </w:abstractNum>
+  <w:num w:numId="1">
+    <w:abstractNumId w:val="3"/>
+  </w:num>
+  <w:num w:numId="2">
+    <w:abstractNumId w:val="2"/>
+  </w:num>
+  <w:num w:numId="3">
+    <w:abstractNumId w:val="0"/>
+  </w:num>
+  <w:num w:numId="4">
+    <w:abstractNumId w:val="1"/>
+  </w:num>
+  <w:num w:numId="5">
+    <w:abstractNumId w:val="4"/>
+  </w:num>
+</w:numbering>
 </file>
 
 <file path=word/styles.xml><?xml version="1.0" encoding="utf-8"?>
@@ -581,6 +1875,26 @@
     <w:name w:val="Normal"/>
     <w:qFormat/>
   </w:style>
+  <w:style w:type="paragraph" w:styleId="Ttulo3">
+    <w:name w:val="heading 3"/>
+    <w:basedOn w:val="Normal"/>
+    <w:link w:val="Ttulo3Char"/>
+    <w:uiPriority w:val="9"/>
+    <w:qFormat/>
+    <w:rsid w:val="005278EA"/>
+    <w:pPr>
+      <w:spacing w:before="100" w:beforeAutospacing="1" w:after="100" w:afterAutospacing="1" w:line="240" w:lineRule="auto"/>
+      <w:outlineLvl w:val="2"/>
+    </w:pPr>
+    <w:rPr>
+      <w:rFonts w:ascii="Times New Roman" w:eastAsia="Times New Roman" w:hAnsi="Times New Roman" w:cs="Times New Roman"/>
+      <w:b/>
+      <w:bCs/>
+      <w:sz w:val="27"/>
+      <w:szCs w:val="27"/>
+      <w:lang w:eastAsia="pt-BR"/>
+    </w:rPr>
+  </w:style>
   <w:style w:type="character" w:default="1" w:styleId="Fontepargpadro">
     <w:name w:val="Default Paragraph Font"/>
     <w:uiPriority w:val="1"/>
@@ -607,6 +1921,38 @@
     <w:uiPriority w:val="99"/>
     <w:semiHidden/>
     <w:unhideWhenUsed/>
+  </w:style>
+  <w:style w:type="character" w:customStyle="1" w:styleId="Ttulo3Char">
+    <w:name w:val="Título 3 Char"/>
+    <w:basedOn w:val="Fontepargpadro"/>
+    <w:link w:val="Ttulo3"/>
+    <w:uiPriority w:val="9"/>
+    <w:rsid w:val="005278EA"/>
+    <w:rPr>
+      <w:rFonts w:ascii="Times New Roman" w:eastAsia="Times New Roman" w:hAnsi="Times New Roman" w:cs="Times New Roman"/>
+      <w:b/>
+      <w:bCs/>
+      <w:sz w:val="27"/>
+      <w:szCs w:val="27"/>
+      <w:lang w:eastAsia="pt-BR"/>
+    </w:rPr>
+  </w:style>
+  <w:style w:type="paragraph" w:styleId="NormalWeb">
+    <w:name w:val="Normal (Web)"/>
+    <w:basedOn w:val="Normal"/>
+    <w:uiPriority w:val="99"/>
+    <w:semiHidden/>
+    <w:unhideWhenUsed/>
+    <w:rsid w:val="005278EA"/>
+    <w:pPr>
+      <w:spacing w:before="100" w:beforeAutospacing="1" w:after="100" w:afterAutospacing="1" w:line="240" w:lineRule="auto"/>
+    </w:pPr>
+    <w:rPr>
+      <w:rFonts w:ascii="Times New Roman" w:eastAsia="Times New Roman" w:hAnsi="Times New Roman" w:cs="Times New Roman"/>
+      <w:sz w:val="24"/>
+      <w:szCs w:val="24"/>
+      <w:lang w:eastAsia="pt-BR"/>
+    </w:rPr>
   </w:style>
 </w:styles>
 </file>

</xml_diff>

<commit_message>
Trabalho sobre comunicação com corpo docente
</commit_message>
<xml_diff>
--- a/Trabalho de BD - Bruno Cano.docx
+++ b/Trabalho de BD - Bruno Cano.docx
@@ -105,13 +105,13 @@
         <w:rPr>
           <w:rFonts w:ascii="Arial" w:hAnsi="Arial" w:cs="Arial"/>
         </w:rPr>
-        <w:t>- Bruno Cano não coopera com a gente, demora pra responder</w:t>
-      </w:r>
-      <w:r>
-        <w:rPr>
-          <w:rFonts w:ascii="Arial" w:hAnsi="Arial" w:cs="Arial"/>
-        </w:rPr>
-        <w:t>, falta de proatividade</w:t>
+        <w:t xml:space="preserve">- </w:t>
+      </w:r>
+      <w:r>
+        <w:rPr>
+          <w:rFonts w:ascii="Arial" w:hAnsi="Arial" w:cs="Arial"/>
+        </w:rPr>
+        <w:t>Falta de comunicação entre professor, coordenador e alunos; não temos meios de contatar professores em casa (Tirar dúvidas), falta de ciência por parte dos alunos sobre eventos escolares por falta de comunicação com o corpo docente, falta de participação dos alunos nas decisões da própria sala (Como decidir dia para pegar matérias, demorou duas semanas).</w:t>
       </w:r>
     </w:p>
     <w:p>
@@ -120,542 +120,232 @@
         <w:rPr>
           <w:rFonts w:ascii="Arial" w:hAnsi="Arial" w:cs="Arial"/>
           <w:b/>
-        </w:rPr>
-      </w:pPr>
-      <w:r>
-        <w:rPr>
-          <w:rFonts w:ascii="Arial" w:hAnsi="Arial" w:cs="Arial"/>
-          <w:b/>
-        </w:rPr>
-        <w:t>IDEIA</w:t>
-      </w:r>
-      <w:r>
-        <w:rPr>
-          <w:rFonts w:ascii="Arial" w:hAnsi="Arial" w:cs="Arial"/>
-          <w:b/>
-        </w:rPr>
-        <w:t xml:space="preserve"> 1</w:t>
-      </w:r>
-    </w:p>
-    <w:p>
-      <w:pPr>
-        <w:rPr>
-          <w:rFonts w:ascii="Arial" w:hAnsi="Arial" w:cs="Arial"/>
-        </w:rPr>
-      </w:pPr>
-      <w:r>
-        <w:rPr>
-          <w:rFonts w:ascii="Arial" w:hAnsi="Arial" w:cs="Arial"/>
-        </w:rPr>
-        <w:t>- Teams</w:t>
-      </w:r>
-    </w:p>
-    <w:p>
-      <w:pPr>
-        <w:rPr>
-          <w:rFonts w:ascii="Arial" w:hAnsi="Arial" w:cs="Arial"/>
-        </w:rPr>
-      </w:pPr>
-      <w:r>
-        <w:rPr>
-          <w:rFonts w:ascii="Arial" w:hAnsi="Arial" w:cs="Arial"/>
-        </w:rPr>
-        <w:t>- Maior problema é: Comunicação com o Bruno Cano e ele com a gente</w:t>
-      </w:r>
-    </w:p>
-    <w:p>
-      <w:pPr>
-        <w:rPr>
-          <w:rFonts w:ascii="Arial" w:hAnsi="Arial" w:cs="Arial"/>
-        </w:rPr>
-      </w:pPr>
-      <w:r>
-        <w:rPr>
-          <w:rFonts w:ascii="Arial" w:hAnsi="Arial" w:cs="Arial"/>
-        </w:rPr>
-        <w:t>- Criar salas para cada curso e ano que ele é coordenador</w:t>
-      </w:r>
-    </w:p>
-    <w:p>
-      <w:pPr>
-        <w:rPr>
-          <w:rFonts w:ascii="Arial" w:hAnsi="Arial" w:cs="Arial"/>
-        </w:rPr>
-      </w:pPr>
-      <w:r>
-        <w:rPr>
-          <w:rFonts w:ascii="Arial" w:hAnsi="Arial" w:cs="Arial"/>
-        </w:rPr>
-        <w:t>- Criar canais e separar por urgência ou assunto</w:t>
-      </w:r>
-    </w:p>
-    <w:p>
-      <w:pPr>
-        <w:rPr>
-          <w:rFonts w:ascii="Arial" w:hAnsi="Arial" w:cs="Arial"/>
-        </w:rPr>
-      </w:pPr>
-      <w:r>
-        <w:rPr>
-          <w:rFonts w:ascii="Arial" w:hAnsi="Arial" w:cs="Arial"/>
-        </w:rPr>
-        <w:t>- Criar comunicados (Como reunião em dias específicos/liberação mais cedo)</w:t>
-      </w:r>
-    </w:p>
-    <w:p>
-      <w:pPr>
-        <w:rPr>
-          <w:rFonts w:ascii="Arial" w:hAnsi="Arial" w:cs="Arial"/>
-        </w:rPr>
-      </w:pPr>
-      <w:r>
-        <w:rPr>
-          <w:rFonts w:ascii="Arial" w:hAnsi="Arial" w:cs="Arial"/>
-        </w:rPr>
-        <w:t>- Os representantes estariam no grupo e também teriam acesso para mandar mensagens. (Precisamos pegar os livros e dizer os dias que não temos nada)</w:t>
-      </w:r>
-    </w:p>
-    <w:p>
-      <w:pPr>
-        <w:rPr>
-          <w:rFonts w:ascii="Arial" w:hAnsi="Arial" w:cs="Arial"/>
-        </w:rPr>
-      </w:pPr>
-      <w:r>
-        <w:rPr>
-          <w:rFonts w:ascii="Arial" w:hAnsi="Arial" w:cs="Arial"/>
-        </w:rPr>
-        <w:t>- Acompanhar andamentos de projetos como ExpoCuca (A gente manda mensagens explicando o que queremos / estamos fazendo)</w:t>
-      </w:r>
-    </w:p>
-    <w:p>
-      <w:pPr>
-        <w:jc w:val="center"/>
-        <w:rPr>
-          <w:rFonts w:ascii="Arial" w:hAnsi="Arial" w:cs="Arial"/>
-        </w:rPr>
-      </w:pPr>
-      <w:r>
-        <w:rPr>
-          <w:rFonts w:ascii="Arial" w:hAnsi="Arial" w:cs="Arial"/>
-          <w:b/>
-        </w:rPr>
-        <w:t>IDEIA 2</w:t>
-      </w:r>
-    </w:p>
-    <w:p>
-      <w:pPr>
-        <w:rPr>
-          <w:rFonts w:ascii="Arial" w:hAnsi="Arial" w:cs="Arial"/>
-        </w:rPr>
-      </w:pPr>
-      <w:r>
-        <w:rPr>
-          <w:rFonts w:ascii="Arial" w:hAnsi="Arial" w:cs="Arial"/>
-        </w:rPr>
-        <w:t>- Criar aplicativo</w:t>
-      </w:r>
-    </w:p>
-    <w:p>
-      <w:pPr>
-        <w:rPr>
-          <w:rFonts w:ascii="Arial" w:hAnsi="Arial" w:cs="Arial"/>
-        </w:rPr>
-      </w:pPr>
-      <w:r>
-        <w:rPr>
-          <w:rFonts w:ascii="Arial" w:hAnsi="Arial" w:cs="Arial"/>
-        </w:rPr>
-        <w:t>- O aplicativo teria</w:t>
-      </w:r>
-    </w:p>
-    <w:p>
-      <w:pPr>
-        <w:jc w:val="center"/>
-        <w:rPr>
-          <w:rFonts w:ascii="Arial" w:hAnsi="Arial" w:cs="Arial"/>
-          <w:b/>
-        </w:rPr>
-      </w:pPr>
-      <w:r>
-        <w:rPr>
-          <w:rFonts w:ascii="Arial" w:hAnsi="Arial" w:cs="Arial"/>
-          <w:b/>
-        </w:rPr>
-        <w:t>SOLUÇÃO</w:t>
-      </w:r>
-    </w:p>
-    <w:p>
-      <w:pPr>
-        <w:rPr>
-          <w:rFonts w:ascii="Arial" w:hAnsi="Arial" w:cs="Arial"/>
-        </w:rPr>
-      </w:pPr>
-      <w:r>
-        <w:rPr>
-          <w:rFonts w:ascii="Arial" w:hAnsi="Arial" w:cs="Arial"/>
-        </w:rPr>
-        <w:t>- Criar um método para deixar os problemas estruturalmente visíveis (Como um SAQ), com denúncias, problemas que estamos tendo. (Coisas que já escrevemos no teams)</w:t>
-      </w:r>
-    </w:p>
-    <w:p>
-      <w:pPr>
-        <w:spacing w:before="100" w:beforeAutospacing="1" w:after="100" w:afterAutospacing="1" w:line="240" w:lineRule="auto"/>
-        <w:outlineLvl w:val="2"/>
-        <w:rPr>
-          <w:rFonts w:ascii="Arial" w:eastAsia="Times New Roman" w:hAnsi="Arial" w:cs="Arial"/>
-          <w:b/>
-          <w:bCs/>
-          <w:lang w:eastAsia="pt-BR"/>
-        </w:rPr>
-      </w:pPr>
-      <w:r>
-        <w:rPr>
-          <w:rFonts w:ascii="Arial" w:eastAsia="Times New Roman" w:hAnsi="Arial" w:cs="Arial"/>
-          <w:b/>
-          <w:bCs/>
-          <w:lang w:eastAsia="pt-BR"/>
-        </w:rPr>
-        <w:t>1. Canal estruturado de ideias</w:t>
-      </w:r>
-    </w:p>
-    <w:p>
-      <w:pPr>
-        <w:numPr>
-          <w:ilvl w:val="0"/>
-          <w:numId w:val="1"/>
-        </w:numPr>
-        <w:spacing w:before="100" w:beforeAutospacing="1" w:after="100" w:afterAutospacing="1" w:line="240" w:lineRule="auto"/>
-        <w:rPr>
-          <w:rFonts w:ascii="Arial" w:eastAsia="Times New Roman" w:hAnsi="Arial" w:cs="Arial"/>
-          <w:lang w:eastAsia="pt-BR"/>
-        </w:rPr>
-      </w:pPr>
-      <w:r>
-        <w:rPr>
-          <w:rFonts w:ascii="Arial" w:eastAsia="Times New Roman" w:hAnsi="Arial" w:cs="Arial"/>
-          <w:lang w:eastAsia="pt-BR"/>
-        </w:rPr>
-        <w:t xml:space="preserve">Envio de sugestões com título + descrição </w:t>
-      </w:r>
-    </w:p>
-    <w:p>
-      <w:pPr>
-        <w:numPr>
-          <w:ilvl w:val="0"/>
-          <w:numId w:val="1"/>
-        </w:numPr>
-        <w:spacing w:before="100" w:beforeAutospacing="1" w:after="100" w:afterAutospacing="1" w:line="240" w:lineRule="auto"/>
-        <w:rPr>
-          <w:rFonts w:ascii="Arial" w:eastAsia="Times New Roman" w:hAnsi="Arial" w:cs="Arial"/>
-          <w:lang w:eastAsia="pt-BR"/>
-        </w:rPr>
-      </w:pPr>
-      <w:r>
-        <w:rPr>
-          <w:rFonts w:ascii="Arial" w:eastAsia="Times New Roman" w:hAnsi="Arial" w:cs="Arial"/>
-          <w:lang w:eastAsia="pt-BR"/>
-        </w:rPr>
-        <w:t xml:space="preserve">Votação da equipe (tipo “curtir” ou priorizar) </w:t>
-      </w:r>
-    </w:p>
-    <w:p>
-      <w:pPr>
-        <w:numPr>
-          <w:ilvl w:val="0"/>
-          <w:numId w:val="1"/>
-        </w:numPr>
-        <w:spacing w:before="100" w:beforeAutospacing="1" w:after="100" w:afterAutospacing="1" w:line="240" w:lineRule="auto"/>
-        <w:rPr>
-          <w:rFonts w:ascii="Arial" w:eastAsia="Times New Roman" w:hAnsi="Arial" w:cs="Arial"/>
-          <w:lang w:eastAsia="pt-BR"/>
-        </w:rPr>
-      </w:pPr>
-      <w:r>
-        <w:rPr>
-          <w:rFonts w:ascii="Arial" w:eastAsia="Times New Roman" w:hAnsi="Arial" w:cs="Arial"/>
-          <w:lang w:eastAsia="pt-BR"/>
-        </w:rPr>
-        <w:t xml:space="preserve">Status: “em análise”, “aprovado”, “rejeitado” </w:t>
-      </w:r>
-    </w:p>
-    <w:p>
-      <w:pPr>
-        <w:spacing w:before="100" w:beforeAutospacing="1" w:after="100" w:afterAutospacing="1" w:line="240" w:lineRule="auto"/>
-        <w:outlineLvl w:val="2"/>
-        <w:rPr>
-          <w:rFonts w:ascii="Arial" w:eastAsia="Times New Roman" w:hAnsi="Arial" w:cs="Arial"/>
-          <w:b/>
-          <w:bCs/>
-          <w:lang w:eastAsia="pt-BR"/>
-        </w:rPr>
-      </w:pPr>
-      <w:r>
-        <w:rPr>
-          <w:rFonts w:ascii="Arial" w:eastAsia="Times New Roman" w:hAnsi="Arial" w:cs="Arial"/>
-          <w:b/>
-          <w:bCs/>
-          <w:lang w:eastAsia="pt-BR"/>
-        </w:rPr>
-        <w:t>2. Registro de problemas (tipo chamado)</w:t>
-      </w:r>
-    </w:p>
-    <w:p>
-      <w:pPr>
-        <w:numPr>
-          <w:ilvl w:val="0"/>
-          <w:numId w:val="2"/>
-        </w:numPr>
-        <w:spacing w:before="100" w:beforeAutospacing="1" w:after="100" w:afterAutospacing="1" w:line="240" w:lineRule="auto"/>
-        <w:rPr>
-          <w:rFonts w:ascii="Arial" w:eastAsia="Times New Roman" w:hAnsi="Arial" w:cs="Arial"/>
-          <w:lang w:eastAsia="pt-BR"/>
-        </w:rPr>
-      </w:pPr>
-      <w:r>
-        <w:rPr>
-          <w:rFonts w:ascii="Arial" w:eastAsia="Times New Roman" w:hAnsi="Arial" w:cs="Arial"/>
-          <w:lang w:eastAsia="pt-BR"/>
-        </w:rPr>
-        <w:t xml:space="preserve">Relatar problemas com data, descrição e impacto </w:t>
-      </w:r>
-    </w:p>
-    <w:p>
-      <w:pPr>
-        <w:numPr>
-          <w:ilvl w:val="0"/>
-          <w:numId w:val="2"/>
-        </w:numPr>
-        <w:spacing w:before="100" w:beforeAutospacing="1" w:after="100" w:afterAutospacing="1" w:line="240" w:lineRule="auto"/>
-        <w:rPr>
-          <w:rFonts w:ascii="Arial" w:eastAsia="Times New Roman" w:hAnsi="Arial" w:cs="Arial"/>
-          <w:lang w:eastAsia="pt-BR"/>
-        </w:rPr>
-      </w:pPr>
-      <w:r>
-        <w:rPr>
-          <w:rFonts w:ascii="Arial" w:eastAsia="Times New Roman" w:hAnsi="Arial" w:cs="Arial"/>
-          <w:lang w:eastAsia="pt-BR"/>
-        </w:rPr>
-        <w:t xml:space="preserve">Possibilidade de anexar evidências (prints, arquivos) </w:t>
-      </w:r>
-    </w:p>
-    <w:p>
-      <w:pPr>
-        <w:numPr>
-          <w:ilvl w:val="0"/>
-          <w:numId w:val="2"/>
-        </w:numPr>
-        <w:spacing w:before="100" w:beforeAutospacing="1" w:after="100" w:afterAutospacing="1" w:line="240" w:lineRule="auto"/>
-        <w:rPr>
-          <w:rFonts w:ascii="Arial" w:eastAsia="Times New Roman" w:hAnsi="Arial" w:cs="Arial"/>
-          <w:lang w:eastAsia="pt-BR"/>
-        </w:rPr>
-      </w:pPr>
-      <w:r>
-        <w:rPr>
-          <w:rFonts w:ascii="Arial" w:eastAsia="Times New Roman" w:hAnsi="Arial" w:cs="Arial"/>
-          <w:lang w:eastAsia="pt-BR"/>
-        </w:rPr>
-        <w:t xml:space="preserve">Acompanhamento: “aberto”, “em andamento”, “resolvido” </w:t>
-      </w:r>
-    </w:p>
-    <w:p>
-      <w:pPr>
-        <w:spacing w:before="100" w:beforeAutospacing="1" w:after="100" w:afterAutospacing="1" w:line="240" w:lineRule="auto"/>
-        <w:outlineLvl w:val="2"/>
-        <w:rPr>
-          <w:rFonts w:ascii="Arial" w:eastAsia="Times New Roman" w:hAnsi="Arial" w:cs="Arial"/>
-          <w:b/>
-          <w:bCs/>
-          <w:lang w:eastAsia="pt-BR"/>
-        </w:rPr>
-      </w:pPr>
-    </w:p>
-    <w:p>
-      <w:pPr>
-        <w:spacing w:before="100" w:beforeAutospacing="1" w:after="100" w:afterAutospacing="1" w:line="240" w:lineRule="auto"/>
-        <w:outlineLvl w:val="2"/>
-        <w:rPr>
-          <w:rFonts w:ascii="Arial" w:eastAsia="Times New Roman" w:hAnsi="Arial" w:cs="Arial"/>
-          <w:b/>
-          <w:bCs/>
-          <w:lang w:eastAsia="pt-BR"/>
         </w:rPr>
       </w:pPr>
       <w:bookmarkStart w:id="0" w:name="_GoBack"/>
       <w:bookmarkEnd w:id="0"/>
-    </w:p>
-    <w:p>
-      <w:pPr>
-        <w:spacing w:before="100" w:beforeAutospacing="1" w:after="100" w:afterAutospacing="1" w:line="240" w:lineRule="auto"/>
-        <w:outlineLvl w:val="2"/>
-        <w:rPr>
-          <w:rFonts w:ascii="Arial" w:eastAsia="Times New Roman" w:hAnsi="Arial" w:cs="Arial"/>
+      <w:r>
+        <w:rPr>
+          <w:rFonts w:ascii="Arial" w:hAnsi="Arial" w:cs="Arial"/>
           <w:b/>
-          <w:bCs/>
-          <w:lang w:eastAsia="pt-BR"/>
-        </w:rPr>
-      </w:pPr>
-      <w:r>
-        <w:rPr>
-          <w:rFonts w:ascii="Arial" w:eastAsia="Times New Roman" w:hAnsi="Arial" w:cs="Arial"/>
+        </w:rPr>
+        <w:t>IDEIA</w:t>
+      </w:r>
+    </w:p>
+    <w:p>
+      <w:pPr>
+        <w:rPr>
+          <w:rFonts w:ascii="Arial" w:hAnsi="Arial" w:cs="Arial"/>
+        </w:rPr>
+      </w:pPr>
+      <w:r>
+        <w:rPr>
+          <w:rFonts w:ascii="Arial" w:hAnsi="Arial" w:cs="Arial"/>
+        </w:rPr>
+        <w:t xml:space="preserve">- Ferramenta utilizada: </w:t>
+      </w:r>
+      <w:proofErr w:type="spellStart"/>
+      <w:r>
+        <w:rPr>
+          <w:rFonts w:ascii="Arial" w:hAnsi="Arial" w:cs="Arial"/>
+        </w:rPr>
+        <w:t>Teams</w:t>
+      </w:r>
+      <w:proofErr w:type="spellEnd"/>
+    </w:p>
+    <w:p>
+      <w:pPr>
+        <w:rPr>
+          <w:rFonts w:ascii="Arial" w:hAnsi="Arial" w:cs="Arial"/>
+        </w:rPr>
+      </w:pPr>
+      <w:r>
+        <w:rPr>
+          <w:rFonts w:ascii="Arial" w:hAnsi="Arial" w:cs="Arial"/>
+        </w:rPr>
+        <w:t>- Maior problema é: Comunicação entre alunos e corpo docente</w:t>
+      </w:r>
+    </w:p>
+    <w:p>
+      <w:pPr>
+        <w:rPr>
+          <w:rFonts w:ascii="Arial" w:hAnsi="Arial" w:cs="Arial"/>
+        </w:rPr>
+      </w:pPr>
+      <w:r>
+        <w:rPr>
+          <w:rFonts w:ascii="Arial" w:hAnsi="Arial" w:cs="Arial"/>
+        </w:rPr>
+        <w:t xml:space="preserve">- Criar um método para deixar os problemas estruturalmente visíveis (Como um SAQ), com denúncias, problemas que estamos tendo. (Coisas que já escrevemos no </w:t>
+      </w:r>
+      <w:proofErr w:type="spellStart"/>
+      <w:r>
+        <w:rPr>
+          <w:rFonts w:ascii="Arial" w:hAnsi="Arial" w:cs="Arial"/>
+        </w:rPr>
+        <w:t>teams</w:t>
+      </w:r>
+      <w:proofErr w:type="spellEnd"/>
+      <w:r>
+        <w:rPr>
+          <w:rFonts w:ascii="Arial" w:hAnsi="Arial" w:cs="Arial"/>
+        </w:rPr>
+        <w:t>)</w:t>
+      </w:r>
+    </w:p>
+    <w:p>
+      <w:pPr>
+        <w:jc w:val="center"/>
+        <w:rPr>
+          <w:rFonts w:ascii="Arial" w:hAnsi="Arial" w:cs="Arial"/>
           <w:b/>
-          <w:bCs/>
-          <w:lang w:eastAsia="pt-BR"/>
-        </w:rPr>
-        <w:lastRenderedPageBreak/>
-        <w:t>3. Comunicação centralizada</w:t>
-      </w:r>
-    </w:p>
-    <w:p>
-      <w:pPr>
-        <w:numPr>
-          <w:ilvl w:val="0"/>
-          <w:numId w:val="3"/>
-        </w:numPr>
-        <w:spacing w:before="100" w:beforeAutospacing="1" w:after="100" w:afterAutospacing="1" w:line="240" w:lineRule="auto"/>
-        <w:rPr>
-          <w:rFonts w:ascii="Arial" w:eastAsia="Times New Roman" w:hAnsi="Arial" w:cs="Arial"/>
-          <w:lang w:eastAsia="pt-BR"/>
-        </w:rPr>
-      </w:pPr>
-      <w:r>
-        <w:rPr>
-          <w:rFonts w:ascii="Arial" w:eastAsia="Times New Roman" w:hAnsi="Arial" w:cs="Arial"/>
-          <w:lang w:eastAsia="pt-BR"/>
-        </w:rPr>
-        <w:t xml:space="preserve">Mensagens organizadas por assunto (não só chat solto) </w:t>
-      </w:r>
-    </w:p>
-    <w:p>
-      <w:pPr>
-        <w:numPr>
-          <w:ilvl w:val="0"/>
-          <w:numId w:val="3"/>
-        </w:numPr>
-        <w:spacing w:before="100" w:beforeAutospacing="1" w:after="100" w:afterAutospacing="1" w:line="240" w:lineRule="auto"/>
-        <w:rPr>
-          <w:rFonts w:ascii="Arial" w:eastAsia="Times New Roman" w:hAnsi="Arial" w:cs="Arial"/>
-          <w:lang w:eastAsia="pt-BR"/>
-        </w:rPr>
-      </w:pPr>
-      <w:r>
-        <w:rPr>
-          <w:rFonts w:ascii="Arial" w:eastAsia="Times New Roman" w:hAnsi="Arial" w:cs="Arial"/>
-          <w:lang w:eastAsia="pt-BR"/>
-        </w:rPr>
-        <w:t xml:space="preserve">Evita ruído e perda de informação </w:t>
-      </w:r>
-    </w:p>
-    <w:p>
-      <w:pPr>
-        <w:spacing w:before="100" w:beforeAutospacing="1" w:after="100" w:afterAutospacing="1" w:line="240" w:lineRule="auto"/>
-        <w:outlineLvl w:val="2"/>
-        <w:rPr>
-          <w:rFonts w:ascii="Arial" w:eastAsia="Times New Roman" w:hAnsi="Arial" w:cs="Arial"/>
+        </w:rPr>
+      </w:pPr>
+      <w:r>
+        <w:rPr>
+          <w:rFonts w:ascii="Arial" w:hAnsi="Arial" w:cs="Arial"/>
           <w:b/>
-          <w:bCs/>
-          <w:lang w:eastAsia="pt-BR"/>
-        </w:rPr>
-      </w:pPr>
-      <w:r>
-        <w:rPr>
-          <w:rFonts w:ascii="Arial" w:eastAsia="Times New Roman" w:hAnsi="Arial" w:cs="Arial"/>
-          <w:b/>
-          <w:bCs/>
-          <w:lang w:eastAsia="pt-BR"/>
-        </w:rPr>
-        <w:t>4. Transparência nas decisões</w:t>
-      </w:r>
-    </w:p>
-    <w:p>
-      <w:pPr>
-        <w:numPr>
-          <w:ilvl w:val="0"/>
-          <w:numId w:val="4"/>
-        </w:numPr>
-        <w:spacing w:before="100" w:beforeAutospacing="1" w:after="100" w:afterAutospacing="1" w:line="240" w:lineRule="auto"/>
-        <w:rPr>
-          <w:rFonts w:ascii="Arial" w:eastAsia="Times New Roman" w:hAnsi="Arial" w:cs="Arial"/>
-          <w:lang w:eastAsia="pt-BR"/>
-        </w:rPr>
-      </w:pPr>
-      <w:r>
-        <w:rPr>
-          <w:rFonts w:ascii="Arial" w:eastAsia="Times New Roman" w:hAnsi="Arial" w:cs="Arial"/>
-          <w:lang w:eastAsia="pt-BR"/>
-        </w:rPr>
-        <w:t xml:space="preserve">Toda decisão registrada com justificativa </w:t>
-      </w:r>
-    </w:p>
-    <w:p>
-      <w:pPr>
-        <w:numPr>
-          <w:ilvl w:val="0"/>
-          <w:numId w:val="4"/>
-        </w:numPr>
-        <w:spacing w:before="100" w:beforeAutospacing="1" w:after="100" w:afterAutospacing="1" w:line="240" w:lineRule="auto"/>
-        <w:rPr>
-          <w:rFonts w:ascii="Arial" w:eastAsia="Times New Roman" w:hAnsi="Arial" w:cs="Arial"/>
-          <w:lang w:eastAsia="pt-BR"/>
-        </w:rPr>
-      </w:pPr>
-      <w:r>
-        <w:rPr>
-          <w:rFonts w:ascii="Arial" w:eastAsia="Times New Roman" w:hAnsi="Arial" w:cs="Arial"/>
-          <w:lang w:eastAsia="pt-BR"/>
-        </w:rPr>
-        <w:t xml:space="preserve">Quem aprovou / recusou </w:t>
-      </w:r>
-    </w:p>
-    <w:p>
-      <w:pPr>
-        <w:spacing w:before="100" w:beforeAutospacing="1" w:after="100" w:afterAutospacing="1" w:line="240" w:lineRule="auto"/>
-        <w:outlineLvl w:val="2"/>
-        <w:rPr>
-          <w:rFonts w:ascii="Arial" w:eastAsia="Times New Roman" w:hAnsi="Arial" w:cs="Arial"/>
-          <w:b/>
-          <w:bCs/>
-          <w:lang w:eastAsia="pt-BR"/>
-        </w:rPr>
-      </w:pPr>
-      <w:r>
-        <w:rPr>
-          <w:rFonts w:ascii="Arial" w:eastAsia="Times New Roman" w:hAnsi="Arial" w:cs="Arial"/>
-          <w:b/>
-          <w:bCs/>
-          <w:lang w:eastAsia="pt-BR"/>
-        </w:rPr>
-        <w:t>5. Feedback anônimo (opcional)</w:t>
-      </w:r>
-    </w:p>
-    <w:p>
-      <w:pPr>
-        <w:numPr>
-          <w:ilvl w:val="0"/>
-          <w:numId w:val="5"/>
-        </w:numPr>
-        <w:spacing w:before="100" w:beforeAutospacing="1" w:after="100" w:afterAutospacing="1" w:line="240" w:lineRule="auto"/>
-        <w:rPr>
-          <w:rFonts w:ascii="Arial" w:eastAsia="Times New Roman" w:hAnsi="Arial" w:cs="Arial"/>
-          <w:lang w:eastAsia="pt-BR"/>
-        </w:rPr>
-      </w:pPr>
-      <w:r>
-        <w:rPr>
-          <w:rFonts w:ascii="Arial" w:eastAsia="Times New Roman" w:hAnsi="Arial" w:cs="Arial"/>
-          <w:lang w:eastAsia="pt-BR"/>
-        </w:rPr>
-        <w:t xml:space="preserve">Permite que a equipe fale sem medo </w:t>
-      </w:r>
-    </w:p>
-    <w:p>
-      <w:pPr>
-        <w:numPr>
-          <w:ilvl w:val="0"/>
-          <w:numId w:val="5"/>
-        </w:numPr>
+        </w:rPr>
+        <w:t>SOLUÇÃO</w:t>
+      </w:r>
+    </w:p>
+    <w:p>
+      <w:pPr>
+        <w:rPr>
+          <w:rFonts w:ascii="Arial" w:hAnsi="Arial" w:cs="Arial"/>
+        </w:rPr>
+      </w:pPr>
+      <w:r>
+        <w:rPr>
+          <w:rFonts w:ascii="Arial" w:hAnsi="Arial" w:cs="Arial"/>
+        </w:rPr>
+        <w:t xml:space="preserve">- Criar salas para cada curso e ano </w:t>
+      </w:r>
+      <w:r>
+        <w:rPr>
+          <w:rFonts w:ascii="Arial" w:hAnsi="Arial" w:cs="Arial"/>
+        </w:rPr>
+        <w:t>com professores e</w:t>
+      </w:r>
+      <w:r>
+        <w:rPr>
+          <w:rFonts w:ascii="Arial" w:hAnsi="Arial" w:cs="Arial"/>
+        </w:rPr>
+        <w:t xml:space="preserve"> coordenador (Colocar os representantes junto dos alunos</w:t>
+      </w:r>
+      <w:r>
+        <w:rPr>
+          <w:rFonts w:ascii="Arial" w:hAnsi="Arial" w:cs="Arial"/>
+        </w:rPr>
+        <w:t xml:space="preserve"> e professor coordenador</w:t>
+      </w:r>
+      <w:r>
+        <w:rPr>
+          <w:rFonts w:ascii="Arial" w:hAnsi="Arial" w:cs="Arial"/>
+        </w:rPr>
+        <w:t>, fazer um chat geral e um apenas com os representantes e coordenador).</w:t>
+      </w:r>
+    </w:p>
+    <w:p>
+      <w:pPr>
+        <w:rPr>
+          <w:rFonts w:ascii="Arial" w:hAnsi="Arial" w:cs="Arial"/>
+        </w:rPr>
+      </w:pPr>
+      <w:r>
+        <w:rPr>
+          <w:rFonts w:ascii="Arial" w:hAnsi="Arial" w:cs="Arial"/>
+        </w:rPr>
+        <w:t>- Criar canais e separar por urgência ou assunto</w:t>
+      </w:r>
+    </w:p>
+    <w:p>
+      <w:pPr>
+        <w:rPr>
+          <w:rFonts w:ascii="Arial" w:hAnsi="Arial" w:cs="Arial"/>
+        </w:rPr>
+      </w:pPr>
+      <w:r>
+        <w:rPr>
+          <w:rFonts w:ascii="Arial" w:hAnsi="Arial" w:cs="Arial"/>
+        </w:rPr>
+        <w:t>- Criar comunicados (Como reunião em dias específicos/</w:t>
+      </w:r>
+      <w:r>
+        <w:rPr>
+          <w:rFonts w:ascii="Arial" w:hAnsi="Arial" w:cs="Arial"/>
+        </w:rPr>
+        <w:t>saídas antecipadas e entradas adiadas/eventos escolares</w:t>
+      </w:r>
+      <w:r>
+        <w:rPr>
+          <w:rFonts w:ascii="Arial" w:hAnsi="Arial" w:cs="Arial"/>
+        </w:rPr>
+        <w:t>)</w:t>
+      </w:r>
+    </w:p>
+    <w:p>
+      <w:pPr>
+        <w:rPr>
+          <w:rFonts w:ascii="Arial" w:hAnsi="Arial" w:cs="Arial"/>
+        </w:rPr>
+      </w:pPr>
+      <w:r>
+        <w:rPr>
+          <w:rFonts w:ascii="Arial" w:hAnsi="Arial" w:cs="Arial"/>
+        </w:rPr>
+        <w:t>- Os representantes estariam no grupo e também teriam acesso para mandar mensagens</w:t>
+      </w:r>
+      <w:r>
+        <w:rPr>
+          <w:rFonts w:ascii="Arial" w:hAnsi="Arial" w:cs="Arial"/>
+        </w:rPr>
+        <w:t xml:space="preserve"> no canal de </w:t>
+      </w:r>
+      <w:proofErr w:type="spellStart"/>
+      <w:r>
+        <w:rPr>
+          <w:rFonts w:ascii="Arial" w:hAnsi="Arial" w:cs="Arial"/>
+        </w:rPr>
+        <w:t>anuncios</w:t>
+      </w:r>
+      <w:proofErr w:type="spellEnd"/>
+      <w:r>
+        <w:rPr>
+          <w:rFonts w:ascii="Arial" w:hAnsi="Arial" w:cs="Arial"/>
+        </w:rPr>
+        <w:t>.</w:t>
+      </w:r>
+    </w:p>
+    <w:p>
+      <w:pPr>
+        <w:rPr>
+          <w:rFonts w:ascii="Arial" w:hAnsi="Arial" w:cs="Arial"/>
+        </w:rPr>
+      </w:pPr>
+      <w:r>
+        <w:rPr>
+          <w:rFonts w:ascii="Arial" w:hAnsi="Arial" w:cs="Arial"/>
+        </w:rPr>
+        <w:t xml:space="preserve">- Acompanhar andamentos de projetos como </w:t>
+      </w:r>
+      <w:proofErr w:type="spellStart"/>
+      <w:r>
+        <w:rPr>
+          <w:rFonts w:ascii="Arial" w:hAnsi="Arial" w:cs="Arial"/>
+        </w:rPr>
+        <w:t>ExpoCuca</w:t>
+      </w:r>
+      <w:proofErr w:type="spellEnd"/>
+      <w:r>
+        <w:rPr>
+          <w:rFonts w:ascii="Arial" w:hAnsi="Arial" w:cs="Arial"/>
+        </w:rPr>
+        <w:t xml:space="preserve"> (A gente manda mensagens explicando o que queremos / estamos fazendo)</w:t>
+      </w:r>
+    </w:p>
+    <w:p>
+      <w:pPr>
         <w:spacing w:before="100" w:beforeAutospacing="1" w:after="100" w:afterAutospacing="1" w:line="240" w:lineRule="auto"/>
         <w:rPr>
           <w:rFonts w:ascii="Arial" w:eastAsia="Times New Roman" w:hAnsi="Arial" w:cs="Arial"/>
@@ -664,22 +354,24 @@
           <w:lang w:eastAsia="pt-BR"/>
         </w:rPr>
       </w:pPr>
-      <w:r>
-        <w:rPr>
-          <w:rFonts w:ascii="Arial" w:eastAsia="Times New Roman" w:hAnsi="Arial" w:cs="Arial"/>
-          <w:lang w:eastAsia="pt-BR"/>
-        </w:rPr>
-        <w:t>Pode revelar padrões de comportamento</w:t>
-      </w:r>
-      <w:r>
+    </w:p>
+    <w:p>
+      <w:pPr>
+        <w:spacing w:before="100" w:beforeAutospacing="1" w:after="100" w:afterAutospacing="1" w:line="240" w:lineRule="auto"/>
         <w:rPr>
           <w:rFonts w:ascii="Arial" w:eastAsia="Times New Roman" w:hAnsi="Arial" w:cs="Arial"/>
           <w:sz w:val="24"/>
           <w:szCs w:val="24"/>
           <w:lang w:eastAsia="pt-BR"/>
         </w:rPr>
-        <w:t xml:space="preserve"> </w:t>
-      </w:r>
+      </w:pPr>
+    </w:p>
+    <w:p>
+      <w:pPr>
+        <w:rPr>
+          <w:rFonts w:ascii="Arial" w:hAnsi="Arial" w:cs="Arial"/>
+        </w:rPr>
+      </w:pPr>
     </w:p>
     <w:p>
       <w:pPr>

</xml_diff>